<commit_message>
Updated Logic for Chronic and Everything Else.
</commit_message>
<xml_diff>
--- a/Group Profile CorporateHRA Scan.docx
+++ b/Group Profile CorporateHRA Scan.docx
@@ -70,44 +70,13 @@
                               <w:jc w:val="center"/>
                               <w:rPr>
                                 <w:color w:val="FF0000"/>
-                                <w:highlight w:val="lightGray"/>
                               </w:rPr>
                             </w:pPr>
                             <w:r>
                               <w:rPr>
                                 <w:color w:val="FF0000"/>
-                                <w:highlight w:val="lightGray"/>
                               </w:rPr>
-                              <w:t>CORPOR</w:t>
-                            </w:r>
-                            <w:r>
-                              <w:rPr>
-                                <w:color w:val="FF0000"/>
-                                <w:highlight w:val="lightGray"/>
-                              </w:rPr>
-                              <w:t>A</w:t>
-                            </w:r>
-                            <w:r>
-                              <w:rPr>
-                                <w:color w:val="FF0000"/>
-                                <w:highlight w:val="lightGray"/>
-                              </w:rPr>
-                              <w:t>TE / INSTITUTION NAME</w:t>
-                            </w:r>
-                          </w:p>
-                          <w:p>
-                            <w:pPr>
-                              <w:jc w:val="center"/>
-                              <w:rPr>
-                                <w:color w:val="FF0000"/>
-                              </w:rPr>
-                            </w:pPr>
-                            <w:r>
-                              <w:rPr>
-                                <w:color w:val="FF0000"/>
-                                <w:highlight w:val="lightGray"/>
-                              </w:rPr>
-                              <w:t>STATE, COUNTRY</w:t>
+                              <w:t>{{company_name}}</w:t>
                             </w:r>
                           </w:p>
                         </w:txbxContent>
@@ -142,44 +111,13 @@
                         <w:jc w:val="center"/>
                         <w:rPr>
                           <w:color w:val="FF0000"/>
-                          <w:highlight w:val="lightGray"/>
                         </w:rPr>
                       </w:pPr>
                       <w:r>
                         <w:rPr>
                           <w:color w:val="FF0000"/>
-                          <w:highlight w:val="lightGray"/>
                         </w:rPr>
-                        <w:t>CORPOR</w:t>
-                      </w:r>
-                      <w:r>
-                        <w:rPr>
-                          <w:color w:val="FF0000"/>
-                          <w:highlight w:val="lightGray"/>
-                        </w:rPr>
-                        <w:t>A</w:t>
-                      </w:r>
-                      <w:r>
-                        <w:rPr>
-                          <w:color w:val="FF0000"/>
-                          <w:highlight w:val="lightGray"/>
-                        </w:rPr>
-                        <w:t>TE / INSTITUTION NAME</w:t>
-                      </w:r>
-                    </w:p>
-                    <w:p>
-                      <w:pPr>
-                        <w:jc w:val="center"/>
-                        <w:rPr>
-                          <w:color w:val="FF0000"/>
-                        </w:rPr>
-                      </w:pPr>
-                      <w:r>
-                        <w:rPr>
-                          <w:color w:val="FF0000"/>
-                          <w:highlight w:val="lightGray"/>
-                        </w:rPr>
-                        <w:t>STATE, COUNTRY</w:t>
+                        <w:t>{{company_name}}</w:t>
                       </w:r>
                     </w:p>
                   </w:txbxContent>
@@ -190,7 +128,6 @@
           </mc:Fallback>
         </mc:AlternateContent>
       </w:r>
-      <w:proofErr w:type="gramStart"/>
       <w:r>
         <w:rPr>
           <w:rFonts w:asciiTheme="minorHAnsi" w:hAnsiTheme="minorHAnsi" w:cstheme="minorHAnsi"/>
@@ -203,24 +140,7 @@
           <w:rFonts w:asciiTheme="minorHAnsi" w:hAnsiTheme="minorHAnsi" w:cstheme="minorHAnsi"/>
           <w:spacing w:val="1"/>
         </w:rPr>
-        <w:t>{{</w:t>
-      </w:r>
-      <w:proofErr w:type="spellStart"/>
-      <w:proofErr w:type="gramEnd"/>
-      <w:r>
-        <w:rPr>
-          <w:rFonts w:asciiTheme="minorHAnsi" w:hAnsiTheme="minorHAnsi" w:cstheme="minorHAnsi"/>
-          <w:spacing w:val="1"/>
-        </w:rPr>
-        <w:t>current_date</w:t>
-      </w:r>
-      <w:proofErr w:type="spellEnd"/>
-      <w:r>
-        <w:rPr>
-          <w:rFonts w:asciiTheme="minorHAnsi" w:hAnsiTheme="minorHAnsi" w:cstheme="minorHAnsi"/>
-          <w:spacing w:val="1"/>
-        </w:rPr>
-        <w:t>}}</w:t>
+        <w:t>{{current_date}}</w:t>
       </w:r>
     </w:p>
     <w:p>
@@ -602,7 +522,6 @@
         </w:rPr>
         <w:t>{</w:t>
       </w:r>
-      <w:proofErr w:type="spellStart"/>
       <w:r>
         <w:rPr>
           <w:rFonts w:asciiTheme="minorHAnsi" w:hAnsiTheme="minorHAnsi" w:cstheme="minorHAnsi"/>
@@ -619,7 +538,6 @@
         </w:rPr>
         <w:t>_date</w:t>
       </w:r>
-      <w:proofErr w:type="spellEnd"/>
       <w:r>
         <w:rPr>
           <w:rFonts w:asciiTheme="minorHAnsi" w:hAnsiTheme="minorHAnsi" w:cstheme="minorHAnsi"/>
@@ -668,27 +586,8 @@
           <w:sz w:val="20"/>
           <w:szCs w:val="20"/>
         </w:rPr>
-        <w:t>{</w:t>
-      </w:r>
-      <w:proofErr w:type="spellStart"/>
-      <w:r>
-        <w:rPr>
-          <w:rFonts w:asciiTheme="minorHAnsi" w:hAnsiTheme="minorHAnsi" w:cstheme="minorHAnsi"/>
-          <w:sz w:val="20"/>
-          <w:szCs w:val="20"/>
-        </w:rPr>
-        <w:t>e_</w:t>
-      </w:r>
-      <w:proofErr w:type="gramStart"/>
-      <w:r>
-        <w:rPr>
-          <w:rFonts w:asciiTheme="minorHAnsi" w:hAnsiTheme="minorHAnsi" w:cstheme="minorHAnsi"/>
-          <w:sz w:val="20"/>
-          <w:szCs w:val="20"/>
-        </w:rPr>
-        <w:t>date</w:t>
-      </w:r>
-      <w:proofErr w:type="spellEnd"/>
+        <w:t>{e_date}</w:t>
+      </w:r>
       <w:r>
         <w:rPr>
           <w:rFonts w:asciiTheme="minorHAnsi" w:hAnsiTheme="minorHAnsi" w:cstheme="minorHAnsi"/>
@@ -703,17 +602,8 @@
           <w:sz w:val="20"/>
           <w:szCs w:val="20"/>
         </w:rPr>
-        <w:t>}</w:t>
-      </w:r>
-      <w:r>
-        <w:rPr>
-          <w:rFonts w:asciiTheme="minorHAnsi" w:hAnsiTheme="minorHAnsi" w:cstheme="minorHAnsi"/>
-          <w:sz w:val="20"/>
-          <w:szCs w:val="20"/>
-        </w:rPr>
         <w:t>.</w:t>
       </w:r>
-      <w:proofErr w:type="gramEnd"/>
     </w:p>
     <w:p>
       <w:pPr>
@@ -853,18 +743,8 @@
           <w:sz w:val="20"/>
           <w:szCs w:val="20"/>
         </w:rPr>
-        <w:t>{</w:t>
-      </w:r>
-      <w:proofErr w:type="spellStart"/>
-      <w:r>
-        <w:rPr>
-          <w:rFonts w:asciiTheme="minorHAnsi" w:hAnsiTheme="minorHAnsi" w:cstheme="minorHAnsi"/>
-          <w:sz w:val="20"/>
-          <w:szCs w:val="20"/>
-        </w:rPr>
-        <w:t>m_per</w:t>
-      </w:r>
-      <w:proofErr w:type="spellEnd"/>
+        <w:t>{m_per</w:t>
+      </w:r>
       <w:r>
         <w:rPr>
           <w:rFonts w:asciiTheme="minorHAnsi" w:hAnsiTheme="minorHAnsi" w:cstheme="minorHAnsi"/>
@@ -905,18 +785,8 @@
           <w:sz w:val="20"/>
           <w:szCs w:val="20"/>
         </w:rPr>
-        <w:t>{</w:t>
-      </w:r>
-      <w:proofErr w:type="spellStart"/>
-      <w:r>
-        <w:rPr>
-          <w:rFonts w:asciiTheme="minorHAnsi" w:hAnsiTheme="minorHAnsi" w:cstheme="minorHAnsi"/>
-          <w:sz w:val="20"/>
-          <w:szCs w:val="20"/>
-        </w:rPr>
-        <w:t>f_per</w:t>
-      </w:r>
-      <w:proofErr w:type="spellEnd"/>
+        <w:t>{f_per</w:t>
+      </w:r>
       <w:r>
         <w:rPr>
           <w:rFonts w:asciiTheme="minorHAnsi" w:hAnsiTheme="minorHAnsi" w:cstheme="minorHAnsi"/>
@@ -1138,7 +1008,6 @@
         </w:rPr>
         <w:t xml:space="preserve"> </w:t>
       </w:r>
-      <w:proofErr w:type="gramStart"/>
       <w:r>
         <w:rPr>
           <w:rFonts w:asciiTheme="minorHAnsi" w:hAnsiTheme="minorHAnsi" w:cstheme="minorHAnsi"/>
@@ -1155,16 +1024,7 @@
           <w:sz w:val="20"/>
           <w:szCs w:val="20"/>
         </w:rPr>
-        <w:t xml:space="preserve"> of</w:t>
-      </w:r>
-      <w:proofErr w:type="gramEnd"/>
-      <w:r>
-        <w:rPr>
-          <w:rFonts w:asciiTheme="minorHAnsi" w:hAnsiTheme="minorHAnsi" w:cstheme="minorHAnsi"/>
-          <w:sz w:val="20"/>
-          <w:szCs w:val="20"/>
-        </w:rPr>
-        <w:t xml:space="preserve"> the </w:t>
+        <w:t xml:space="preserve"> of the </w:t>
       </w:r>
       <w:r>
         <w:rPr>
@@ -1252,34 +1112,7 @@
           <w:sz w:val="20"/>
           <w:szCs w:val="20"/>
         </w:rPr>
-        <w:t>falls within the 31–</w:t>
-      </w:r>
-      <w:proofErr w:type="gramStart"/>
-      <w:r>
-        <w:rPr>
-          <w:rFonts w:asciiTheme="minorHAnsi" w:hAnsiTheme="minorHAnsi" w:cstheme="minorHAnsi"/>
-          <w:sz w:val="20"/>
-          <w:szCs w:val="20"/>
-        </w:rPr>
-        <w:t>40 year</w:t>
-      </w:r>
-      <w:proofErr w:type="gramEnd"/>
-      <w:r>
-        <w:rPr>
-          <w:rFonts w:asciiTheme="minorHAnsi" w:hAnsiTheme="minorHAnsi" w:cstheme="minorHAnsi"/>
-          <w:sz w:val="20"/>
-          <w:szCs w:val="20"/>
-        </w:rPr>
-        <w:t xml:space="preserve"> age group. </w:t>
-      </w:r>
-      <w:proofErr w:type="gramStart"/>
-      <w:r>
-        <w:rPr>
-          <w:rFonts w:asciiTheme="minorHAnsi" w:hAnsiTheme="minorHAnsi" w:cstheme="minorHAnsi"/>
-          <w:sz w:val="20"/>
-          <w:szCs w:val="20"/>
-        </w:rPr>
-        <w:t xml:space="preserve">Cumulatively, </w:t>
+        <w:t xml:space="preserve">falls within the 31–40 year age group. Cumulatively, </w:t>
       </w:r>
       <w:r>
         <w:rPr>
@@ -1289,23 +1122,13 @@
         </w:rPr>
         <w:t>{{</w:t>
       </w:r>
-      <w:proofErr w:type="gramEnd"/>
-      <w:r>
-        <w:rPr>
-          <w:rFonts w:asciiTheme="minorHAnsi" w:hAnsiTheme="minorHAnsi" w:cstheme="minorHAnsi"/>
-          <w:sz w:val="20"/>
-          <w:szCs w:val="20"/>
-        </w:rPr>
-        <w:t>under_40_</w:t>
-      </w:r>
-      <w:proofErr w:type="gramStart"/>
-      <w:r>
-        <w:rPr>
-          <w:rFonts w:asciiTheme="minorHAnsi" w:hAnsiTheme="minorHAnsi" w:cstheme="minorHAnsi"/>
-          <w:sz w:val="20"/>
-          <w:szCs w:val="20"/>
-        </w:rPr>
-        <w:t>per</w:t>
+      <w:r>
+        <w:rPr>
+          <w:rFonts w:asciiTheme="minorHAnsi" w:hAnsiTheme="minorHAnsi" w:cstheme="minorHAnsi"/>
+          <w:sz w:val="20"/>
+          <w:szCs w:val="20"/>
+        </w:rPr>
+        <w:t>under_40_per</w:t>
       </w:r>
       <w:r>
         <w:rPr>
@@ -1331,7 +1154,6 @@
         </w:rPr>
         <w:t>%</w:t>
       </w:r>
-      <w:proofErr w:type="gramEnd"/>
       <w:r>
         <w:rPr>
           <w:rFonts w:asciiTheme="minorHAnsi" w:hAnsiTheme="minorHAnsi" w:cstheme="minorHAnsi"/>
@@ -1354,16 +1176,7 @@
           <w:sz w:val="20"/>
           <w:szCs w:val="20"/>
         </w:rPr>
-        <w:t>age_40_plus_</w:t>
-      </w:r>
-      <w:proofErr w:type="gramStart"/>
-      <w:r>
-        <w:rPr>
-          <w:rFonts w:asciiTheme="minorHAnsi" w:hAnsiTheme="minorHAnsi" w:cstheme="minorHAnsi"/>
-          <w:sz w:val="20"/>
-          <w:szCs w:val="20"/>
-        </w:rPr>
-        <w:t>p</w:t>
+        <w:t>age_40_plus_p</w:t>
       </w:r>
       <w:r>
         <w:rPr>
@@ -1397,7 +1210,6 @@
         </w:rPr>
         <w:t>%</w:t>
       </w:r>
-      <w:proofErr w:type="gramEnd"/>
       <w:r>
         <w:rPr>
           <w:rFonts w:asciiTheme="minorHAnsi" w:hAnsiTheme="minorHAnsi" w:cstheme="minorHAnsi"/>
@@ -1522,7 +1334,6 @@
         </w:rPr>
         <w:t>{{</w:t>
       </w:r>
-      <w:proofErr w:type="spellStart"/>
       <w:r>
         <w:rPr>
           <w:rFonts w:asciiTheme="minorHAnsi" w:hAnsiTheme="minorHAnsi" w:cstheme="minorHAnsi"/>
@@ -1531,7 +1342,6 @@
         </w:rPr>
         <w:t>asian_descent_pct</w:t>
       </w:r>
-      <w:proofErr w:type="spellEnd"/>
       <w:r>
         <w:rPr>
           <w:rFonts w:asciiTheme="minorHAnsi" w:hAnsiTheme="minorHAnsi" w:cstheme="minorHAnsi"/>
@@ -1576,7 +1386,6 @@
         </w:rPr>
         <w:t>{{</w:t>
       </w:r>
-      <w:proofErr w:type="spellStart"/>
       <w:r>
         <w:rPr>
           <w:rStyle w:val="Strong"/>
@@ -1586,8 +1395,6 @@
         </w:rPr>
         <w:t>middle_eastern_pct</w:t>
       </w:r>
-      <w:proofErr w:type="spellEnd"/>
-      <w:proofErr w:type="gramStart"/>
       <w:r>
         <w:rPr>
           <w:rStyle w:val="Strong"/>
@@ -1604,9 +1411,28 @@
           <w:sz w:val="20"/>
           <w:szCs w:val="20"/>
         </w:rPr>
-        <w:t>%</w:t>
-      </w:r>
-      <w:proofErr w:type="gramEnd"/>
+        <w:t>% Middle Eastern</w:t>
+      </w:r>
+      <w:r>
+        <w:rPr>
+          <w:rFonts w:asciiTheme="minorHAnsi" w:hAnsiTheme="minorHAnsi" w:cstheme="minorHAnsi"/>
+          <w:b/>
+          <w:bCs/>
+          <w:sz w:val="20"/>
+          <w:szCs w:val="20"/>
+        </w:rPr>
+        <w:t xml:space="preserve">, </w:t>
+      </w:r>
+      <w:r>
+        <w:rPr>
+          <w:rFonts w:asciiTheme="minorHAnsi" w:hAnsiTheme="minorHAnsi" w:cstheme="minorHAnsi"/>
+          <w:b/>
+          <w:bCs/>
+          <w:sz w:val="20"/>
+          <w:szCs w:val="20"/>
+        </w:rPr>
+        <w:t>{{</w:t>
+      </w:r>
       <w:r>
         <w:rPr>
           <w:rStyle w:val="Strong"/>
@@ -1614,7 +1440,25 @@
           <w:sz w:val="20"/>
           <w:szCs w:val="20"/>
         </w:rPr>
-        <w:t xml:space="preserve"> Middle Eastern</w:t>
+        <w:t>african_descent_pct</w:t>
+      </w:r>
+      <w:r>
+        <w:rPr>
+          <w:rStyle w:val="Strong"/>
+          <w:rFonts w:asciiTheme="minorHAnsi" w:eastAsiaTheme="majorEastAsia" w:hAnsiTheme="minorHAnsi" w:cstheme="minorHAnsi"/>
+          <w:sz w:val="20"/>
+          <w:szCs w:val="20"/>
+        </w:rPr>
+        <w:t>}}</w:t>
+      </w:r>
+      <w:r>
+        <w:rPr>
+          <w:rStyle w:val="Strong"/>
+          <w:rFonts w:asciiTheme="minorHAnsi" w:eastAsiaTheme="majorEastAsia" w:hAnsiTheme="minorHAnsi" w:cstheme="minorHAnsi"/>
+          <w:sz w:val="20"/>
+          <w:szCs w:val="20"/>
+        </w:rPr>
+        <w:t>% African</w:t>
       </w:r>
       <w:r>
         <w:rPr>
@@ -1629,14 +1473,21 @@
       <w:r>
         <w:rPr>
           <w:rFonts w:asciiTheme="minorHAnsi" w:hAnsiTheme="minorHAnsi" w:cstheme="minorHAnsi"/>
+          <w:sz w:val="20"/>
+          <w:szCs w:val="20"/>
+        </w:rPr>
+        <w:t>and</w:t>
+      </w:r>
+      <w:r>
+        <w:rPr>
+          <w:rFonts w:asciiTheme="minorHAnsi" w:hAnsiTheme="minorHAnsi" w:cstheme="minorHAnsi"/>
           <w:b/>
           <w:bCs/>
           <w:sz w:val="20"/>
           <w:szCs w:val="20"/>
         </w:rPr>
-        <w:t>{{</w:t>
-      </w:r>
-      <w:proofErr w:type="spellStart"/>
+        <w:t xml:space="preserve"> </w:t>
+      </w:r>
       <w:r>
         <w:rPr>
           <w:rStyle w:val="Strong"/>
@@ -1644,10 +1495,8 @@
           <w:sz w:val="20"/>
           <w:szCs w:val="20"/>
         </w:rPr>
-        <w:t>african_descent_pct</w:t>
-      </w:r>
-      <w:proofErr w:type="spellEnd"/>
-      <w:proofErr w:type="gramStart"/>
+        <w:t>{{</w:t>
+      </w:r>
       <w:r>
         <w:rPr>
           <w:rStyle w:val="Strong"/>
@@ -1655,7 +1504,7 @@
           <w:sz w:val="20"/>
           <w:szCs w:val="20"/>
         </w:rPr>
-        <w:t>}}</w:t>
+        <w:t>european_descent_pct</w:t>
       </w:r>
       <w:r>
         <w:rPr>
@@ -1664,9 +1513,8 @@
           <w:sz w:val="20"/>
           <w:szCs w:val="20"/>
         </w:rPr>
-        <w:t>%</w:t>
-      </w:r>
-      <w:proofErr w:type="gramEnd"/>
+        <w:t>}}</w:t>
+      </w:r>
       <w:r>
         <w:rPr>
           <w:rStyle w:val="Strong"/>
@@ -1674,76 +1522,8 @@
           <w:sz w:val="20"/>
           <w:szCs w:val="20"/>
         </w:rPr>
-        <w:t xml:space="preserve"> African</w:t>
-      </w:r>
-      <w:r>
-        <w:rPr>
-          <w:rFonts w:asciiTheme="minorHAnsi" w:hAnsiTheme="minorHAnsi" w:cstheme="minorHAnsi"/>
-          <w:b/>
-          <w:bCs/>
-          <w:sz w:val="20"/>
-          <w:szCs w:val="20"/>
-        </w:rPr>
-        <w:t xml:space="preserve">, </w:t>
-      </w:r>
-      <w:r>
-        <w:rPr>
-          <w:rFonts w:asciiTheme="minorHAnsi" w:hAnsiTheme="minorHAnsi" w:cstheme="minorHAnsi"/>
-          <w:sz w:val="20"/>
-          <w:szCs w:val="20"/>
-        </w:rPr>
-        <w:t>and</w:t>
-      </w:r>
-      <w:r>
-        <w:rPr>
-          <w:rFonts w:asciiTheme="minorHAnsi" w:hAnsiTheme="minorHAnsi" w:cstheme="minorHAnsi"/>
-          <w:b/>
-          <w:bCs/>
-          <w:sz w:val="20"/>
-          <w:szCs w:val="20"/>
-        </w:rPr>
-        <w:t xml:space="preserve"> </w:t>
-      </w:r>
-      <w:r>
-        <w:rPr>
-          <w:rStyle w:val="Strong"/>
-          <w:rFonts w:asciiTheme="minorHAnsi" w:eastAsiaTheme="majorEastAsia" w:hAnsiTheme="minorHAnsi" w:cstheme="minorHAnsi"/>
-          <w:sz w:val="20"/>
-          <w:szCs w:val="20"/>
-        </w:rPr>
-        <w:t>{{</w:t>
-      </w:r>
-      <w:proofErr w:type="spellStart"/>
-      <w:r>
-        <w:rPr>
-          <w:rStyle w:val="Strong"/>
-          <w:rFonts w:asciiTheme="minorHAnsi" w:eastAsiaTheme="majorEastAsia" w:hAnsiTheme="minorHAnsi" w:cstheme="minorHAnsi"/>
-          <w:sz w:val="20"/>
-          <w:szCs w:val="20"/>
-        </w:rPr>
-        <w:t>european_descent_pct</w:t>
-      </w:r>
-      <w:proofErr w:type="spellEnd"/>
-      <w:proofErr w:type="gramStart"/>
-      <w:r>
-        <w:rPr>
-          <w:rStyle w:val="Strong"/>
-          <w:rFonts w:asciiTheme="minorHAnsi" w:eastAsiaTheme="majorEastAsia" w:hAnsiTheme="minorHAnsi" w:cstheme="minorHAnsi"/>
-          <w:sz w:val="20"/>
-          <w:szCs w:val="20"/>
-        </w:rPr>
-        <w:t>}}</w:t>
-      </w:r>
-      <w:r>
-        <w:rPr>
-          <w:rStyle w:val="Strong"/>
-          <w:rFonts w:asciiTheme="minorHAnsi" w:eastAsiaTheme="majorEastAsia" w:hAnsiTheme="minorHAnsi" w:cstheme="minorHAnsi"/>
-          <w:sz w:val="20"/>
-          <w:szCs w:val="20"/>
-        </w:rPr>
         <w:t>%</w:t>
       </w:r>
-      <w:proofErr w:type="gramEnd"/>
       <w:r>
         <w:rPr>
           <w:rStyle w:val="Strong"/>
@@ -1899,27 +1679,7 @@
           <w:sz w:val="20"/>
           <w:szCs w:val="20"/>
         </w:rPr>
-        <w:t xml:space="preserve">Overweight and obesity has influence on overall health of an individual. Obesity is liked </w:t>
-      </w:r>
-      <w:proofErr w:type="gramStart"/>
-      <w:r>
-        <w:rPr>
-          <w:rFonts w:asciiTheme="minorHAnsi" w:hAnsiTheme="minorHAnsi" w:cstheme="minorHAnsi"/>
-          <w:bCs/>
-          <w:sz w:val="20"/>
-          <w:szCs w:val="20"/>
-        </w:rPr>
-        <w:t>to</w:t>
-      </w:r>
-      <w:proofErr w:type="gramEnd"/>
-      <w:r>
-        <w:rPr>
-          <w:rFonts w:asciiTheme="minorHAnsi" w:hAnsiTheme="minorHAnsi" w:cstheme="minorHAnsi"/>
-          <w:bCs/>
-          <w:sz w:val="20"/>
-          <w:szCs w:val="20"/>
-        </w:rPr>
-        <w:t xml:space="preserve"> various </w:t>
+        <w:t xml:space="preserve">Overweight and obesity has influence on overall health of an individual. Obesity is liked to various </w:t>
       </w:r>
       <w:r>
         <w:rPr>
@@ -1976,7 +1736,6 @@
         </w:rPr>
         <w:t>{{</w:t>
       </w:r>
-      <w:proofErr w:type="spellStart"/>
       <w:r>
         <w:rPr>
           <w:rFonts w:asciiTheme="minorHAnsi" w:hAnsiTheme="minorHAnsi" w:cstheme="minorHAnsi"/>
@@ -1985,8 +1744,6 @@
         </w:rPr>
         <w:t>underweight_bmi_pct</w:t>
       </w:r>
-      <w:proofErr w:type="spellEnd"/>
-      <w:proofErr w:type="gramStart"/>
       <w:r>
         <w:rPr>
           <w:rFonts w:asciiTheme="minorHAnsi" w:hAnsiTheme="minorHAnsi" w:cstheme="minorHAnsi"/>
@@ -2003,7 +1760,6 @@
         </w:rPr>
         <w:t>%</w:t>
       </w:r>
-      <w:proofErr w:type="gramEnd"/>
       <w:r>
         <w:rPr>
           <w:rFonts w:asciiTheme="minorHAnsi" w:hAnsiTheme="minorHAnsi" w:cstheme="minorHAnsi"/>
@@ -2164,7 +1920,6 @@
         </w:rPr>
         <w:t xml:space="preserve"> </w:t>
       </w:r>
-      <w:proofErr w:type="gramStart"/>
       <w:r>
         <w:rPr>
           <w:rFonts w:asciiTheme="minorHAnsi" w:hAnsiTheme="minorHAnsi" w:cstheme="minorHAnsi"/>
@@ -2183,26 +1938,14 @@
         </w:rPr>
         <w:t>{{</w:t>
       </w:r>
-      <w:proofErr w:type="spellStart"/>
-      <w:r>
-        <w:rPr>
-          <w:rFonts w:asciiTheme="minorHAnsi" w:hAnsiTheme="minorHAnsi" w:cstheme="minorHAnsi"/>
-          <w:sz w:val="20"/>
-          <w:szCs w:val="20"/>
-        </w:rPr>
-        <w:t>normal</w:t>
-      </w:r>
-      <w:proofErr w:type="gramEnd"/>
-      <w:r>
-        <w:rPr>
-          <w:rFonts w:asciiTheme="minorHAnsi" w:hAnsiTheme="minorHAnsi" w:cstheme="minorHAnsi"/>
-          <w:sz w:val="20"/>
-          <w:szCs w:val="20"/>
-        </w:rPr>
-        <w:t>_weight_pct</w:t>
-      </w:r>
-      <w:proofErr w:type="spellEnd"/>
-      <w:proofErr w:type="gramStart"/>
+      <w:r>
+        <w:rPr>
+          <w:rFonts w:asciiTheme="minorHAnsi" w:hAnsiTheme="minorHAnsi" w:cstheme="minorHAnsi"/>
+          <w:sz w:val="20"/>
+          <w:szCs w:val="20"/>
+        </w:rPr>
+        <w:t>normal_weight_pct</w:t>
+      </w:r>
       <w:r>
         <w:rPr>
           <w:rFonts w:asciiTheme="minorHAnsi" w:hAnsiTheme="minorHAnsi" w:cstheme="minorHAnsi"/>
@@ -2219,7 +1962,6 @@
         </w:rPr>
         <w:t>%</w:t>
       </w:r>
-      <w:proofErr w:type="gramEnd"/>
       <w:r>
         <w:rPr>
           <w:rFonts w:asciiTheme="minorHAnsi" w:hAnsiTheme="minorHAnsi" w:cstheme="minorHAnsi"/>
@@ -2359,7 +2101,6 @@
           <w:szCs w:val="20"/>
         </w:rPr>
       </w:pPr>
-      <w:proofErr w:type="gramStart"/>
       <w:r>
         <w:rPr>
           <w:rFonts w:asciiTheme="minorHAnsi" w:hAnsiTheme="minorHAnsi" w:cstheme="minorHAnsi"/>
@@ -2386,9 +2127,8 @@
           <w:sz w:val="20"/>
           <w:szCs w:val="20"/>
         </w:rPr>
-        <w:t>Weight</w:t>
-      </w:r>
-      <w:proofErr w:type="gramEnd"/>
+        <w:t xml:space="preserve">Weight: </w:t>
+      </w:r>
       <w:r>
         <w:rPr>
           <w:rFonts w:asciiTheme="minorHAnsi" w:hAnsiTheme="minorHAnsi" w:cstheme="minorHAnsi"/>
@@ -2396,18 +2136,8 @@
           <w:sz w:val="20"/>
           <w:szCs w:val="20"/>
         </w:rPr>
-        <w:t xml:space="preserve">: </w:t>
-      </w:r>
-      <w:r>
-        <w:rPr>
-          <w:rFonts w:asciiTheme="minorHAnsi" w:hAnsiTheme="minorHAnsi" w:cstheme="minorHAnsi"/>
-          <w:b/>
-          <w:sz w:val="20"/>
-          <w:szCs w:val="20"/>
-        </w:rPr>
         <w:t>{{</w:t>
       </w:r>
-      <w:proofErr w:type="spellStart"/>
       <w:r>
         <w:rPr>
           <w:rFonts w:asciiTheme="minorHAnsi" w:hAnsiTheme="minorHAnsi" w:cstheme="minorHAnsi"/>
@@ -2416,8 +2146,6 @@
         </w:rPr>
         <w:t>overweight_bmi_pct</w:t>
       </w:r>
-      <w:proofErr w:type="spellEnd"/>
-      <w:proofErr w:type="gramStart"/>
       <w:r>
         <w:rPr>
           <w:rFonts w:asciiTheme="minorHAnsi" w:hAnsiTheme="minorHAnsi" w:cstheme="minorHAnsi"/>
@@ -2434,7 +2162,6 @@
         </w:rPr>
         <w:t>%</w:t>
       </w:r>
-      <w:proofErr w:type="gramEnd"/>
       <w:r>
         <w:rPr>
           <w:rFonts w:asciiTheme="minorHAnsi" w:hAnsiTheme="minorHAnsi" w:cstheme="minorHAnsi"/>
@@ -2512,7 +2239,6 @@
         </w:rPr>
         <w:t xml:space="preserve"> </w:t>
       </w:r>
-      <w:proofErr w:type="gramStart"/>
       <w:r>
         <w:rPr>
           <w:rFonts w:asciiTheme="minorHAnsi" w:hAnsiTheme="minorHAnsi" w:cstheme="minorHAnsi"/>
@@ -2536,16 +2262,7 @@
           <w:sz w:val="20"/>
           <w:szCs w:val="20"/>
         </w:rPr>
-        <w:t>Weight</w:t>
-      </w:r>
-      <w:proofErr w:type="gramEnd"/>
-      <w:r>
-        <w:rPr>
-          <w:rFonts w:asciiTheme="minorHAnsi" w:hAnsiTheme="minorHAnsi" w:cstheme="minorHAnsi"/>
-          <w:sz w:val="20"/>
-          <w:szCs w:val="20"/>
-        </w:rPr>
-        <w:t xml:space="preserve"> with BMI between 25.1 to 29.9 Kg/m</w:t>
+        <w:t>Weight with BMI between 25.1 to 29.9 Kg/m</w:t>
       </w:r>
       <w:r>
         <w:rPr>
@@ -2584,7 +2301,6 @@
           <w:szCs w:val="20"/>
         </w:rPr>
       </w:pPr>
-      <w:proofErr w:type="gramStart"/>
       <w:r>
         <w:rPr>
           <w:rFonts w:asciiTheme="minorHAnsi" w:hAnsiTheme="minorHAnsi" w:cstheme="minorHAnsi"/>
@@ -2613,8 +2329,6 @@
         </w:rPr>
         <w:t>{{</w:t>
       </w:r>
-      <w:proofErr w:type="spellStart"/>
-      <w:proofErr w:type="gramEnd"/>
       <w:r>
         <w:rPr>
           <w:rFonts w:asciiTheme="minorHAnsi" w:hAnsiTheme="minorHAnsi" w:cstheme="minorHAnsi"/>
@@ -2625,8 +2339,6 @@
         </w:rPr>
         <w:t>obese_total_pct</w:t>
       </w:r>
-      <w:proofErr w:type="spellEnd"/>
-      <w:proofErr w:type="gramStart"/>
       <w:r>
         <w:rPr>
           <w:rFonts w:asciiTheme="minorHAnsi" w:hAnsiTheme="minorHAnsi" w:cstheme="minorHAnsi"/>
@@ -2645,7 +2357,6 @@
         </w:rPr>
         <w:t>%</w:t>
       </w:r>
-      <w:proofErr w:type="gramEnd"/>
       <w:r>
         <w:rPr>
           <w:rFonts w:asciiTheme="minorHAnsi" w:hAnsiTheme="minorHAnsi" w:cstheme="minorHAnsi"/>
@@ -2776,7 +2487,6 @@
         </w:rPr>
         <w:t>obese_grade1_pct</w:t>
       </w:r>
-      <w:proofErr w:type="gramStart"/>
       <w:r>
         <w:rPr>
           <w:rFonts w:asciiTheme="minorHAnsi" w:hAnsiTheme="minorHAnsi" w:cstheme="minorHAnsi"/>
@@ -2791,16 +2501,7 @@
           <w:sz w:val="20"/>
           <w:szCs w:val="20"/>
         </w:rPr>
-        <w:t>%</w:t>
-      </w:r>
-      <w:proofErr w:type="gramEnd"/>
-      <w:r>
-        <w:rPr>
-          <w:rFonts w:asciiTheme="minorHAnsi" w:hAnsiTheme="minorHAnsi" w:cstheme="minorHAnsi"/>
-          <w:sz w:val="20"/>
-          <w:szCs w:val="20"/>
-        </w:rPr>
-        <w:t xml:space="preserve"> are found to be Gr I obese with BMI between 30 – 35 Kg/m</w:t>
+        <w:t>% are found to be Gr I obese with BMI between 30 – 35 Kg/m</w:t>
       </w:r>
       <w:r>
         <w:rPr>
@@ -2847,7 +2548,6 @@
         </w:rPr>
         <w:t>obese_grade2_pct</w:t>
       </w:r>
-      <w:proofErr w:type="gramStart"/>
       <w:r>
         <w:rPr>
           <w:rFonts w:asciiTheme="minorHAnsi" w:hAnsiTheme="minorHAnsi" w:cstheme="minorHAnsi"/>
@@ -2862,16 +2562,7 @@
           <w:sz w:val="20"/>
           <w:szCs w:val="20"/>
         </w:rPr>
-        <w:t>%</w:t>
-      </w:r>
-      <w:proofErr w:type="gramEnd"/>
-      <w:r>
-        <w:rPr>
-          <w:rFonts w:asciiTheme="minorHAnsi" w:hAnsiTheme="minorHAnsi" w:cstheme="minorHAnsi"/>
-          <w:sz w:val="20"/>
-          <w:szCs w:val="20"/>
-        </w:rPr>
-        <w:t xml:space="preserve"> are found to be Gr II obese with BMI between 35.1 – 39.9 Kg/m</w:t>
+        <w:t>% are found to be Gr II obese with BMI between 35.1 – 39.9 Kg/m</w:t>
       </w:r>
       <w:r>
         <w:rPr>
@@ -2910,7 +2601,6 @@
         </w:rPr>
         <w:t>{{</w:t>
       </w:r>
-      <w:proofErr w:type="spellStart"/>
       <w:r>
         <w:rPr>
           <w:rFonts w:asciiTheme="minorHAnsi" w:hAnsiTheme="minorHAnsi" w:cstheme="minorHAnsi"/>
@@ -2919,8 +2609,6 @@
         </w:rPr>
         <w:t>obese_gross_pct</w:t>
       </w:r>
-      <w:proofErr w:type="spellEnd"/>
-      <w:proofErr w:type="gramStart"/>
       <w:r>
         <w:rPr>
           <w:rFonts w:asciiTheme="minorHAnsi" w:hAnsiTheme="minorHAnsi" w:cstheme="minorHAnsi"/>
@@ -2935,16 +2623,7 @@
           <w:sz w:val="20"/>
           <w:szCs w:val="20"/>
         </w:rPr>
-        <w:t>%</w:t>
-      </w:r>
-      <w:proofErr w:type="gramEnd"/>
-      <w:r>
-        <w:rPr>
-          <w:rFonts w:asciiTheme="minorHAnsi" w:hAnsiTheme="minorHAnsi" w:cstheme="minorHAnsi"/>
-          <w:sz w:val="20"/>
-          <w:szCs w:val="20"/>
-        </w:rPr>
-        <w:t xml:space="preserve"> are found to be grossly obese with BMI above 40 Kg/m</w:t>
+        <w:t>% are found to be grossly obese with BMI above 40 Kg/m</w:t>
       </w:r>
       <w:r>
         <w:rPr>
@@ -3138,9 +2817,8 @@
           <w:sz w:val="20"/>
           <w:szCs w:val="20"/>
         </w:rPr>
-        <w:t>{{</w:t>
-      </w:r>
-      <w:proofErr w:type="spellStart"/>
+        <w:t>{{nut_poor}}</w:t>
+      </w:r>
       <w:r>
         <w:rPr>
           <w:rFonts w:asciiTheme="minorHAnsi" w:hAnsiTheme="minorHAnsi" w:cstheme="minorHAnsi"/>
@@ -3148,35 +2826,6 @@
           <w:sz w:val="20"/>
           <w:szCs w:val="20"/>
         </w:rPr>
-        <w:t>nut_</w:t>
-      </w:r>
-      <w:proofErr w:type="gramStart"/>
-      <w:r>
-        <w:rPr>
-          <w:rFonts w:asciiTheme="minorHAnsi" w:hAnsiTheme="minorHAnsi" w:cstheme="minorHAnsi"/>
-          <w:spacing w:val="-1"/>
-          <w:sz w:val="20"/>
-          <w:szCs w:val="20"/>
-        </w:rPr>
-        <w:t>poor</w:t>
-      </w:r>
-      <w:proofErr w:type="spellEnd"/>
-      <w:r>
-        <w:rPr>
-          <w:rFonts w:asciiTheme="minorHAnsi" w:hAnsiTheme="minorHAnsi" w:cstheme="minorHAnsi"/>
-          <w:spacing w:val="-1"/>
-          <w:sz w:val="20"/>
-          <w:szCs w:val="20"/>
-        </w:rPr>
-        <w:t>}}</w:t>
-      </w:r>
-      <w:r>
-        <w:rPr>
-          <w:rFonts w:asciiTheme="minorHAnsi" w:hAnsiTheme="minorHAnsi" w:cstheme="minorHAnsi"/>
-          <w:spacing w:val="-1"/>
-          <w:sz w:val="20"/>
-          <w:szCs w:val="20"/>
-        </w:rPr>
         <w:t xml:space="preserve"> </w:t>
       </w:r>
       <w:r>
@@ -3187,7 +2836,6 @@
         </w:rPr>
         <w:t>%</w:t>
       </w:r>
-      <w:proofErr w:type="gramEnd"/>
       <w:r>
         <w:rPr>
           <w:rFonts w:asciiTheme="minorHAnsi" w:hAnsiTheme="minorHAnsi" w:cstheme="minorHAnsi"/>
@@ -3354,7 +3002,6 @@
         </w:rPr>
         <w:t>_</w:t>
       </w:r>
-      <w:proofErr w:type="gramStart"/>
       <w:r>
         <w:rPr>
           <w:rFonts w:asciiTheme="minorHAnsi" w:hAnsiTheme="minorHAnsi" w:cstheme="minorHAnsi"/>
@@ -3390,7 +3037,6 @@
         </w:rPr>
         <w:t>%</w:t>
       </w:r>
-      <w:proofErr w:type="gramEnd"/>
       <w:r>
         <w:rPr>
           <w:rFonts w:asciiTheme="minorHAnsi" w:hAnsiTheme="minorHAnsi" w:cstheme="minorHAnsi"/>
@@ -3474,25 +3120,7 @@
           <w:sz w:val="20"/>
           <w:szCs w:val="20"/>
         </w:rPr>
-        <w:t xml:space="preserve">under nourished as they lack eating fruits &amp; vegetables more than 2 days a week. They may </w:t>
-      </w:r>
-      <w:proofErr w:type="gramStart"/>
-      <w:r>
-        <w:rPr>
-          <w:rFonts w:asciiTheme="minorHAnsi" w:hAnsiTheme="minorHAnsi" w:cstheme="minorHAnsi"/>
-          <w:sz w:val="20"/>
-          <w:szCs w:val="20"/>
-        </w:rPr>
-        <w:t>lack in</w:t>
-      </w:r>
-      <w:proofErr w:type="gramEnd"/>
-      <w:r>
-        <w:rPr>
-          <w:rFonts w:asciiTheme="minorHAnsi" w:hAnsiTheme="minorHAnsi" w:cstheme="minorHAnsi"/>
-          <w:sz w:val="20"/>
-          <w:szCs w:val="20"/>
-        </w:rPr>
-        <w:t xml:space="preserve"> vitamins &amp; essential minerals.</w:t>
+        <w:t>under nourished as they lack eating fruits &amp; vegetables more than 2 days a week. They may lack in vitamins &amp; essential minerals.</w:t>
       </w:r>
     </w:p>
     <w:p>
@@ -3530,7 +3158,6 @@
         </w:rPr>
         <w:t>2_n</w:t>
       </w:r>
-      <w:proofErr w:type="gramStart"/>
       <w:r>
         <w:rPr>
           <w:rFonts w:asciiTheme="minorHAnsi" w:hAnsiTheme="minorHAnsi" w:cstheme="minorHAnsi"/>
@@ -3547,7 +3174,6 @@
         </w:rPr>
         <w:t>%</w:t>
       </w:r>
-      <w:proofErr w:type="gramEnd"/>
       <w:r>
         <w:rPr>
           <w:rFonts w:asciiTheme="minorHAnsi" w:hAnsiTheme="minorHAnsi" w:cstheme="minorHAnsi"/>
@@ -3631,25 +3257,7 @@
           <w:sz w:val="20"/>
           <w:szCs w:val="20"/>
         </w:rPr>
-        <w:t>rich diet as they consume fried food, fast food</w:t>
-      </w:r>
-      <w:proofErr w:type="gramStart"/>
-      <w:r>
-        <w:rPr>
-          <w:rFonts w:asciiTheme="minorHAnsi" w:hAnsiTheme="minorHAnsi" w:cstheme="minorHAnsi"/>
-          <w:sz w:val="20"/>
-          <w:szCs w:val="20"/>
-        </w:rPr>
-        <w:t>, commercial food</w:t>
-      </w:r>
-      <w:proofErr w:type="gramEnd"/>
-      <w:r>
-        <w:rPr>
-          <w:rFonts w:asciiTheme="minorHAnsi" w:hAnsiTheme="minorHAnsi" w:cstheme="minorHAnsi"/>
-          <w:sz w:val="20"/>
-          <w:szCs w:val="20"/>
-        </w:rPr>
-        <w:t xml:space="preserve"> more than 3 days a week.</w:t>
+        <w:t>rich diet as they consume fried food, fast food, commercial food more than 3 days a week.</w:t>
       </w:r>
     </w:p>
     <w:p>
@@ -3687,9 +3295,8 @@
           <w:sz w:val="20"/>
           <w:szCs w:val="20"/>
         </w:rPr>
-        <w:t>4_</w:t>
-      </w:r>
-      <w:proofErr w:type="gramStart"/>
+        <w:t>4_n</w:t>
+      </w:r>
       <w:r>
         <w:rPr>
           <w:rFonts w:asciiTheme="minorHAnsi" w:hAnsiTheme="minorHAnsi" w:cstheme="minorHAnsi"/>
@@ -3697,7 +3304,7 @@
           <w:sz w:val="20"/>
           <w:szCs w:val="20"/>
         </w:rPr>
-        <w:t>n</w:t>
+        <w:t>}}</w:t>
       </w:r>
       <w:r>
         <w:rPr>
@@ -3706,7 +3313,15 @@
           <w:sz w:val="20"/>
           <w:szCs w:val="20"/>
         </w:rPr>
-        <w:t>}}</w:t>
+        <w:t xml:space="preserve"> </w:t>
+      </w:r>
+      <w:r>
+        <w:rPr>
+          <w:rFonts w:asciiTheme="minorHAnsi" w:hAnsiTheme="minorHAnsi" w:cstheme="minorHAnsi"/>
+          <w:sz w:val="20"/>
+          <w:szCs w:val="20"/>
+        </w:rPr>
+        <w:t>%</w:t>
       </w:r>
       <w:r>
         <w:rPr>
@@ -3723,9 +3338,25 @@
           <w:sz w:val="20"/>
           <w:szCs w:val="20"/>
         </w:rPr>
-        <w:t>%</w:t>
-      </w:r>
-      <w:proofErr w:type="gramEnd"/>
+        <w:t>of</w:t>
+      </w:r>
+      <w:r>
+        <w:rPr>
+          <w:rFonts w:asciiTheme="minorHAnsi" w:hAnsiTheme="minorHAnsi" w:cstheme="minorHAnsi"/>
+          <w:spacing w:val="-2"/>
+          <w:sz w:val="20"/>
+          <w:szCs w:val="20"/>
+        </w:rPr>
+        <w:t xml:space="preserve"> </w:t>
+      </w:r>
+      <w:r>
+        <w:rPr>
+          <w:rFonts w:asciiTheme="minorHAnsi" w:hAnsiTheme="minorHAnsi" w:cstheme="minorHAnsi"/>
+          <w:sz w:val="20"/>
+          <w:szCs w:val="20"/>
+        </w:rPr>
+        <w:t>your</w:t>
+      </w:r>
       <w:r>
         <w:rPr>
           <w:rFonts w:asciiTheme="minorHAnsi" w:hAnsiTheme="minorHAnsi" w:cstheme="minorHAnsi"/>
@@ -3741,24 +3372,7 @@
           <w:sz w:val="20"/>
           <w:szCs w:val="20"/>
         </w:rPr>
-        <w:t>of</w:t>
-      </w:r>
-      <w:r>
-        <w:rPr>
-          <w:rFonts w:asciiTheme="minorHAnsi" w:hAnsiTheme="minorHAnsi" w:cstheme="minorHAnsi"/>
-          <w:spacing w:val="-2"/>
-          <w:sz w:val="20"/>
-          <w:szCs w:val="20"/>
-        </w:rPr>
-        <w:t xml:space="preserve"> </w:t>
-      </w:r>
-      <w:r>
-        <w:rPr>
-          <w:rFonts w:asciiTheme="minorHAnsi" w:hAnsiTheme="minorHAnsi" w:cstheme="minorHAnsi"/>
-          <w:sz w:val="20"/>
-          <w:szCs w:val="20"/>
-        </w:rPr>
-        <w:t>your</w:t>
+        <w:t>group</w:t>
       </w:r>
       <w:r>
         <w:rPr>
@@ -3767,44 +3381,7 @@
           <w:sz w:val="20"/>
           <w:szCs w:val="20"/>
         </w:rPr>
-        <w:t xml:space="preserve"> </w:t>
-      </w:r>
-      <w:r>
-        <w:rPr>
-          <w:rFonts w:asciiTheme="minorHAnsi" w:hAnsiTheme="minorHAnsi" w:cstheme="minorHAnsi"/>
-          <w:sz w:val="20"/>
-          <w:szCs w:val="20"/>
-        </w:rPr>
-        <w:t>group</w:t>
-      </w:r>
-      <w:r>
-        <w:rPr>
-          <w:rFonts w:asciiTheme="minorHAnsi" w:hAnsiTheme="minorHAnsi" w:cstheme="minorHAnsi"/>
-          <w:spacing w:val="-1"/>
-          <w:sz w:val="20"/>
-          <w:szCs w:val="20"/>
-        </w:rPr>
-        <w:t xml:space="preserve"> are prone to </w:t>
-      </w:r>
-      <w:proofErr w:type="gramStart"/>
-      <w:r>
-        <w:rPr>
-          <w:rFonts w:asciiTheme="minorHAnsi" w:hAnsiTheme="minorHAnsi" w:cstheme="minorHAnsi"/>
-          <w:spacing w:val="-1"/>
-          <w:sz w:val="20"/>
-          <w:szCs w:val="20"/>
-        </w:rPr>
-        <w:t>employee</w:t>
-      </w:r>
-      <w:proofErr w:type="gramEnd"/>
-      <w:r>
-        <w:rPr>
-          <w:rFonts w:asciiTheme="minorHAnsi" w:hAnsiTheme="minorHAnsi" w:cstheme="minorHAnsi"/>
-          <w:spacing w:val="-1"/>
-          <w:sz w:val="20"/>
-          <w:szCs w:val="20"/>
-        </w:rPr>
-        <w:t xml:space="preserve"> </w:t>
+        <w:t xml:space="preserve"> are prone to employee </w:t>
       </w:r>
       <w:r>
         <w:rPr>
@@ -3861,7 +3438,6 @@
         </w:rPr>
         <w:t>_</w:t>
       </w:r>
-      <w:proofErr w:type="gramStart"/>
       <w:r>
         <w:rPr>
           <w:rFonts w:asciiTheme="minorHAnsi" w:hAnsiTheme="minorHAnsi" w:cstheme="minorHAnsi"/>
@@ -3897,7 +3473,6 @@
         </w:rPr>
         <w:t>%</w:t>
       </w:r>
-      <w:proofErr w:type="gramEnd"/>
       <w:r>
         <w:rPr>
           <w:rFonts w:asciiTheme="minorHAnsi" w:hAnsiTheme="minorHAnsi" w:cstheme="minorHAnsi"/>
@@ -3956,47 +3531,7 @@
           <w:sz w:val="20"/>
           <w:szCs w:val="20"/>
         </w:rPr>
-        <w:t xml:space="preserve"> may develop dehydration as they consume </w:t>
-      </w:r>
-      <w:proofErr w:type="gramStart"/>
-      <w:r>
-        <w:rPr>
-          <w:rFonts w:asciiTheme="minorHAnsi" w:hAnsiTheme="minorHAnsi" w:cstheme="minorHAnsi"/>
-          <w:spacing w:val="-1"/>
-          <w:sz w:val="20"/>
-          <w:szCs w:val="20"/>
-        </w:rPr>
-        <w:t>less of</w:t>
-      </w:r>
-      <w:proofErr w:type="gramEnd"/>
-      <w:r>
-        <w:rPr>
-          <w:rFonts w:asciiTheme="minorHAnsi" w:hAnsiTheme="minorHAnsi" w:cstheme="minorHAnsi"/>
-          <w:spacing w:val="-1"/>
-          <w:sz w:val="20"/>
-          <w:szCs w:val="20"/>
-        </w:rPr>
-        <w:t xml:space="preserve"> fluids </w:t>
-      </w:r>
-      <w:proofErr w:type="gramStart"/>
-      <w:r>
-        <w:rPr>
-          <w:rFonts w:asciiTheme="minorHAnsi" w:hAnsiTheme="minorHAnsi" w:cstheme="minorHAnsi"/>
-          <w:spacing w:val="-1"/>
-          <w:sz w:val="20"/>
-          <w:szCs w:val="20"/>
-        </w:rPr>
-        <w:t>as per</w:t>
-      </w:r>
-      <w:proofErr w:type="gramEnd"/>
-      <w:r>
-        <w:rPr>
-          <w:rFonts w:asciiTheme="minorHAnsi" w:hAnsiTheme="minorHAnsi" w:cstheme="minorHAnsi"/>
-          <w:spacing w:val="-1"/>
-          <w:sz w:val="20"/>
-          <w:szCs w:val="20"/>
-        </w:rPr>
-        <w:t xml:space="preserve"> RDA.</w:t>
+        <w:t xml:space="preserve"> may develop dehydration as they consume less of fluids as per RDA.</w:t>
       </w:r>
     </w:p>
     <w:p>
@@ -4094,25 +3629,7 @@
           <w:sz w:val="20"/>
           <w:szCs w:val="20"/>
         </w:rPr>
-        <w:t>{{</w:t>
-      </w:r>
-      <w:proofErr w:type="spellStart"/>
-      <w:r>
-        <w:rPr>
-          <w:rFonts w:asciiTheme="minorHAnsi" w:hAnsiTheme="minorHAnsi" w:cstheme="minorHAnsi"/>
-          <w:sz w:val="20"/>
-          <w:szCs w:val="20"/>
-        </w:rPr>
-        <w:t>exe_all_n</w:t>
-      </w:r>
-      <w:proofErr w:type="spellEnd"/>
-      <w:r>
-        <w:rPr>
-          <w:rFonts w:asciiTheme="minorHAnsi" w:hAnsiTheme="minorHAnsi" w:cstheme="minorHAnsi"/>
-          <w:sz w:val="20"/>
-          <w:szCs w:val="20"/>
-        </w:rPr>
-        <w:t>}}</w:t>
+        <w:t>{{exe_all_n}}</w:t>
       </w:r>
       <w:r>
         <w:rPr>
@@ -4225,9 +3742,8 @@
           <w:sz w:val="20"/>
           <w:szCs w:val="20"/>
         </w:rPr>
-        <w:t>{{</w:t>
-      </w:r>
-      <w:proofErr w:type="spellStart"/>
+        <w:t>{{muscu_oth_pct}}</w:t>
+      </w:r>
       <w:r>
         <w:rPr>
           <w:rFonts w:asciiTheme="minorHAnsi" w:hAnsiTheme="minorHAnsi" w:cstheme="minorHAnsi"/>
@@ -4235,9 +3751,33 @@
           <w:sz w:val="20"/>
           <w:szCs w:val="20"/>
         </w:rPr>
-        <w:t>muscu_oth_</w:t>
-      </w:r>
-      <w:proofErr w:type="gramStart"/>
+        <w:t xml:space="preserve"> </w:t>
+      </w:r>
+      <w:r>
+        <w:rPr>
+          <w:rFonts w:asciiTheme="minorHAnsi" w:hAnsiTheme="minorHAnsi" w:cstheme="minorHAnsi"/>
+          <w:sz w:val="20"/>
+          <w:szCs w:val="20"/>
+        </w:rPr>
+        <w:t>%</w:t>
+      </w:r>
+      <w:r>
+        <w:rPr>
+          <w:rFonts w:asciiTheme="minorHAnsi" w:hAnsiTheme="minorHAnsi" w:cstheme="minorHAnsi"/>
+          <w:spacing w:val="-1"/>
+          <w:sz w:val="20"/>
+          <w:szCs w:val="20"/>
+        </w:rPr>
+        <w:t xml:space="preserve"> </w:t>
+      </w:r>
+      <w:r>
+        <w:rPr>
+          <w:rFonts w:asciiTheme="minorHAnsi" w:hAnsiTheme="minorHAnsi" w:cstheme="minorHAnsi"/>
+          <w:sz w:val="20"/>
+          <w:szCs w:val="20"/>
+        </w:rPr>
+        <w:t>of</w:t>
+      </w:r>
       <w:r>
         <w:rPr>
           <w:rFonts w:asciiTheme="minorHAnsi" w:hAnsiTheme="minorHAnsi" w:cstheme="minorHAnsi"/>
@@ -4245,9 +3785,33 @@
           <w:sz w:val="20"/>
           <w:szCs w:val="20"/>
         </w:rPr>
-        <w:t>pct</w:t>
-      </w:r>
-      <w:proofErr w:type="spellEnd"/>
+        <w:t xml:space="preserve"> </w:t>
+      </w:r>
+      <w:r>
+        <w:rPr>
+          <w:rFonts w:asciiTheme="minorHAnsi" w:hAnsiTheme="minorHAnsi" w:cstheme="minorHAnsi"/>
+          <w:sz w:val="20"/>
+          <w:szCs w:val="20"/>
+        </w:rPr>
+        <w:t>your</w:t>
+      </w:r>
+      <w:r>
+        <w:rPr>
+          <w:rFonts w:asciiTheme="minorHAnsi" w:hAnsiTheme="minorHAnsi" w:cstheme="minorHAnsi"/>
+          <w:spacing w:val="-1"/>
+          <w:sz w:val="20"/>
+          <w:szCs w:val="20"/>
+        </w:rPr>
+        <w:t xml:space="preserve"> </w:t>
+      </w:r>
+      <w:r>
+        <w:rPr>
+          <w:rFonts w:asciiTheme="minorHAnsi" w:hAnsiTheme="minorHAnsi" w:cstheme="minorHAnsi"/>
+          <w:sz w:val="20"/>
+          <w:szCs w:val="20"/>
+        </w:rPr>
+        <w:t>group</w:t>
+      </w:r>
       <w:r>
         <w:rPr>
           <w:rFonts w:asciiTheme="minorHAnsi" w:hAnsiTheme="minorHAnsi" w:cstheme="minorHAnsi"/>
@@ -4255,7 +3819,32 @@
           <w:sz w:val="20"/>
           <w:szCs w:val="20"/>
         </w:rPr>
-        <w:t>}}</w:t>
+        <w:t xml:space="preserve"> </w:t>
+      </w:r>
+      <w:r>
+        <w:rPr>
+          <w:rFonts w:asciiTheme="minorHAnsi" w:hAnsiTheme="minorHAnsi" w:cstheme="minorHAnsi"/>
+          <w:sz w:val="20"/>
+          <w:szCs w:val="20"/>
+        </w:rPr>
+        <w:t>is</w:t>
+      </w:r>
+      <w:r>
+        <w:rPr>
+          <w:rFonts w:asciiTheme="minorHAnsi" w:hAnsiTheme="minorHAnsi" w:cstheme="minorHAnsi"/>
+          <w:spacing w:val="-1"/>
+          <w:sz w:val="20"/>
+          <w:szCs w:val="20"/>
+        </w:rPr>
+        <w:t xml:space="preserve"> overall </w:t>
+      </w:r>
+      <w:r>
+        <w:rPr>
+          <w:rFonts w:asciiTheme="minorHAnsi" w:hAnsiTheme="minorHAnsi" w:cstheme="minorHAnsi"/>
+          <w:sz w:val="20"/>
+          <w:szCs w:val="20"/>
+        </w:rPr>
+        <w:t>physically</w:t>
       </w:r>
       <w:r>
         <w:rPr>
@@ -4272,129 +3861,7 @@
           <w:sz w:val="20"/>
           <w:szCs w:val="20"/>
         </w:rPr>
-        <w:t>%</w:t>
-      </w:r>
-      <w:proofErr w:type="gramEnd"/>
-      <w:r>
-        <w:rPr>
-          <w:rFonts w:asciiTheme="minorHAnsi" w:hAnsiTheme="minorHAnsi" w:cstheme="minorHAnsi"/>
-          <w:spacing w:val="-1"/>
-          <w:sz w:val="20"/>
-          <w:szCs w:val="20"/>
-        </w:rPr>
-        <w:t xml:space="preserve"> </w:t>
-      </w:r>
-      <w:r>
-        <w:rPr>
-          <w:rFonts w:asciiTheme="minorHAnsi" w:hAnsiTheme="minorHAnsi" w:cstheme="minorHAnsi"/>
-          <w:sz w:val="20"/>
-          <w:szCs w:val="20"/>
-        </w:rPr>
-        <w:t>of</w:t>
-      </w:r>
-      <w:r>
-        <w:rPr>
-          <w:rFonts w:asciiTheme="minorHAnsi" w:hAnsiTheme="minorHAnsi" w:cstheme="minorHAnsi"/>
-          <w:spacing w:val="-2"/>
-          <w:sz w:val="20"/>
-          <w:szCs w:val="20"/>
-        </w:rPr>
-        <w:t xml:space="preserve"> </w:t>
-      </w:r>
-      <w:r>
-        <w:rPr>
-          <w:rFonts w:asciiTheme="minorHAnsi" w:hAnsiTheme="minorHAnsi" w:cstheme="minorHAnsi"/>
-          <w:sz w:val="20"/>
-          <w:szCs w:val="20"/>
-        </w:rPr>
-        <w:t>your</w:t>
-      </w:r>
-      <w:r>
-        <w:rPr>
-          <w:rFonts w:asciiTheme="minorHAnsi" w:hAnsiTheme="minorHAnsi" w:cstheme="minorHAnsi"/>
-          <w:spacing w:val="-1"/>
-          <w:sz w:val="20"/>
-          <w:szCs w:val="20"/>
-        </w:rPr>
-        <w:t xml:space="preserve"> </w:t>
-      </w:r>
-      <w:r>
-        <w:rPr>
-          <w:rFonts w:asciiTheme="minorHAnsi" w:hAnsiTheme="minorHAnsi" w:cstheme="minorHAnsi"/>
-          <w:sz w:val="20"/>
-          <w:szCs w:val="20"/>
-        </w:rPr>
-        <w:t>group</w:t>
-      </w:r>
-      <w:r>
-        <w:rPr>
-          <w:rFonts w:asciiTheme="minorHAnsi" w:hAnsiTheme="minorHAnsi" w:cstheme="minorHAnsi"/>
-          <w:spacing w:val="-2"/>
-          <w:sz w:val="20"/>
-          <w:szCs w:val="20"/>
-        </w:rPr>
-        <w:t xml:space="preserve"> </w:t>
-      </w:r>
-      <w:r>
-        <w:rPr>
-          <w:rFonts w:asciiTheme="minorHAnsi" w:hAnsiTheme="minorHAnsi" w:cstheme="minorHAnsi"/>
-          <w:sz w:val="20"/>
-          <w:szCs w:val="20"/>
-        </w:rPr>
-        <w:t>is</w:t>
-      </w:r>
-      <w:r>
-        <w:rPr>
-          <w:rFonts w:asciiTheme="minorHAnsi" w:hAnsiTheme="minorHAnsi" w:cstheme="minorHAnsi"/>
-          <w:spacing w:val="-1"/>
-          <w:sz w:val="20"/>
-          <w:szCs w:val="20"/>
-        </w:rPr>
-        <w:t xml:space="preserve"> </w:t>
-      </w:r>
-      <w:proofErr w:type="gramStart"/>
-      <w:r>
-        <w:rPr>
-          <w:rFonts w:asciiTheme="minorHAnsi" w:hAnsiTheme="minorHAnsi" w:cstheme="minorHAnsi"/>
-          <w:spacing w:val="-1"/>
-          <w:sz w:val="20"/>
-          <w:szCs w:val="20"/>
-        </w:rPr>
-        <w:t xml:space="preserve">overall </w:t>
-      </w:r>
-      <w:r>
-        <w:rPr>
-          <w:rFonts w:asciiTheme="minorHAnsi" w:hAnsiTheme="minorHAnsi" w:cstheme="minorHAnsi"/>
-          <w:sz w:val="20"/>
-          <w:szCs w:val="20"/>
-        </w:rPr>
-        <w:t>physically</w:t>
-      </w:r>
-      <w:r>
-        <w:rPr>
-          <w:rFonts w:asciiTheme="minorHAnsi" w:hAnsiTheme="minorHAnsi" w:cstheme="minorHAnsi"/>
-          <w:spacing w:val="-2"/>
-          <w:sz w:val="20"/>
-          <w:szCs w:val="20"/>
-        </w:rPr>
-        <w:t xml:space="preserve"> </w:t>
-      </w:r>
-      <w:r>
-        <w:rPr>
-          <w:rFonts w:asciiTheme="minorHAnsi" w:hAnsiTheme="minorHAnsi" w:cstheme="minorHAnsi"/>
-          <w:sz w:val="20"/>
-          <w:szCs w:val="20"/>
-        </w:rPr>
-        <w:t>unfit</w:t>
-      </w:r>
-      <w:proofErr w:type="gramEnd"/>
-      <w:r>
-        <w:rPr>
-          <w:rFonts w:asciiTheme="minorHAnsi" w:hAnsiTheme="minorHAnsi" w:cstheme="minorHAnsi"/>
-          <w:sz w:val="20"/>
-          <w:szCs w:val="20"/>
-        </w:rPr>
-        <w:t xml:space="preserve"> due to various reasons such as obesity, back pain, etc.</w:t>
+        <w:t>unfit due to various reasons such as obesity, back pain, etc.</w:t>
       </w:r>
     </w:p>
     <w:p>
@@ -4689,9 +4156,8 @@
           <w:sz w:val="20"/>
           <w:szCs w:val="20"/>
         </w:rPr>
-        <w:t>{{</w:t>
-      </w:r>
-      <w:proofErr w:type="spellStart"/>
+        <w:t>{{low_hr_breath}}</w:t>
+      </w:r>
       <w:r>
         <w:rPr>
           <w:rFonts w:asciiTheme="minorHAnsi" w:hAnsiTheme="minorHAnsi" w:cstheme="minorHAnsi"/>
@@ -4699,35 +4165,6 @@
           <w:sz w:val="20"/>
           <w:szCs w:val="20"/>
         </w:rPr>
-        <w:t>low_hr_</w:t>
-      </w:r>
-      <w:proofErr w:type="gramStart"/>
-      <w:r>
-        <w:rPr>
-          <w:rFonts w:asciiTheme="minorHAnsi" w:hAnsiTheme="minorHAnsi" w:cstheme="minorHAnsi"/>
-          <w:spacing w:val="-2"/>
-          <w:sz w:val="20"/>
-          <w:szCs w:val="20"/>
-        </w:rPr>
-        <w:t>breath</w:t>
-      </w:r>
-      <w:proofErr w:type="spellEnd"/>
-      <w:r>
-        <w:rPr>
-          <w:rFonts w:asciiTheme="minorHAnsi" w:hAnsiTheme="minorHAnsi" w:cstheme="minorHAnsi"/>
-          <w:spacing w:val="-2"/>
-          <w:sz w:val="20"/>
-          <w:szCs w:val="20"/>
-        </w:rPr>
-        <w:t>}}</w:t>
-      </w:r>
-      <w:r>
-        <w:rPr>
-          <w:rFonts w:asciiTheme="minorHAnsi" w:hAnsiTheme="minorHAnsi" w:cstheme="minorHAnsi"/>
-          <w:spacing w:val="-2"/>
-          <w:sz w:val="20"/>
-          <w:szCs w:val="20"/>
-        </w:rPr>
         <w:t xml:space="preserve"> </w:t>
       </w:r>
       <w:r>
@@ -4738,7 +4175,6 @@
         </w:rPr>
         <w:t>%</w:t>
       </w:r>
-      <w:proofErr w:type="gramEnd"/>
       <w:r>
         <w:rPr>
           <w:rFonts w:asciiTheme="minorHAnsi" w:hAnsiTheme="minorHAnsi" w:cstheme="minorHAnsi"/>
@@ -4854,9 +4290,8 @@
           <w:sz w:val="20"/>
           <w:szCs w:val="20"/>
         </w:rPr>
-        <w:t xml:space="preserve">Overall Stress &amp; </w:t>
-      </w:r>
-      <w:proofErr w:type="gramStart"/>
+        <w:t>Overall Stress &amp; Presenteeism:</w:t>
+      </w:r>
       <w:r>
         <w:rPr>
           <w:rStyle w:val="Strong"/>
@@ -4864,7 +4299,7 @@
           <w:sz w:val="20"/>
           <w:szCs w:val="20"/>
         </w:rPr>
-        <w:t>Presenteeism:</w:t>
+        <w:t xml:space="preserve"> </w:t>
       </w:r>
       <w:r>
         <w:rPr>
@@ -4873,7 +4308,7 @@
           <w:sz w:val="20"/>
           <w:szCs w:val="20"/>
         </w:rPr>
-        <w:t xml:space="preserve"> </w:t>
+        <w:t>{{</w:t>
       </w:r>
       <w:r>
         <w:rPr>
@@ -4882,10 +4317,8 @@
           <w:sz w:val="20"/>
           <w:szCs w:val="20"/>
         </w:rPr>
-        <w:t>{{</w:t>
-      </w:r>
-      <w:proofErr w:type="spellStart"/>
-      <w:proofErr w:type="gramEnd"/>
+        <w:t>overall_stress_pct</w:t>
+      </w:r>
       <w:r>
         <w:rPr>
           <w:rStyle w:val="Strong"/>
@@ -4893,9 +4326,8 @@
           <w:sz w:val="20"/>
           <w:szCs w:val="20"/>
         </w:rPr>
-        <w:t>overall_stress_</w:t>
-      </w:r>
-      <w:proofErr w:type="gramStart"/>
+        <w:t>}}</w:t>
+      </w:r>
       <w:r>
         <w:rPr>
           <w:rStyle w:val="Strong"/>
@@ -4903,28 +4335,8 @@
           <w:sz w:val="20"/>
           <w:szCs w:val="20"/>
         </w:rPr>
-        <w:t>pct</w:t>
-      </w:r>
-      <w:proofErr w:type="spellEnd"/>
-      <w:r>
-        <w:rPr>
-          <w:rStyle w:val="Strong"/>
-          <w:rFonts w:asciiTheme="minorHAnsi" w:eastAsiaTheme="majorEastAsia" w:hAnsiTheme="minorHAnsi" w:cstheme="minorHAnsi"/>
-          <w:sz w:val="20"/>
-          <w:szCs w:val="20"/>
-        </w:rPr>
-        <w:t>}}</w:t>
-      </w:r>
-      <w:r>
-        <w:rPr>
-          <w:rStyle w:val="Strong"/>
-          <w:rFonts w:asciiTheme="minorHAnsi" w:eastAsiaTheme="majorEastAsia" w:hAnsiTheme="minorHAnsi" w:cstheme="minorHAnsi"/>
-          <w:sz w:val="20"/>
-          <w:szCs w:val="20"/>
-        </w:rPr>
         <w:t xml:space="preserve"> %</w:t>
       </w:r>
-      <w:proofErr w:type="gramEnd"/>
       <w:r>
         <w:rPr>
           <w:rFonts w:asciiTheme="minorHAnsi" w:hAnsiTheme="minorHAnsi" w:cstheme="minorHAnsi"/>
@@ -4956,17 +4368,7 @@
           <w:sz w:val="20"/>
           <w:szCs w:val="20"/>
         </w:rPr>
-        <w:t xml:space="preserve">Home &amp; Social </w:t>
-      </w:r>
-      <w:proofErr w:type="gramStart"/>
-      <w:r>
-        <w:rPr>
-          <w:rStyle w:val="Strong"/>
-          <w:rFonts w:asciiTheme="minorHAnsi" w:eastAsiaTheme="majorEastAsia" w:hAnsiTheme="minorHAnsi" w:cstheme="minorHAnsi"/>
-          <w:sz w:val="20"/>
-          <w:szCs w:val="20"/>
-        </w:rPr>
-        <w:t>Stress:</w:t>
+        <w:t>Home &amp; Social Stress:</w:t>
       </w:r>
       <w:r>
         <w:rPr>
@@ -4984,26 +4386,14 @@
         </w:rPr>
         <w:t>{{</w:t>
       </w:r>
-      <w:proofErr w:type="spellStart"/>
-      <w:proofErr w:type="gramEnd"/>
-      <w:r>
-        <w:rPr>
-          <w:rFonts w:asciiTheme="minorHAnsi" w:hAnsiTheme="minorHAnsi" w:cstheme="minorHAnsi"/>
-          <w:sz w:val="20"/>
-          <w:szCs w:val="20"/>
-        </w:rPr>
-        <w:t>home_social_stress_</w:t>
-      </w:r>
-      <w:proofErr w:type="gramStart"/>
-      <w:r>
-        <w:rPr>
-          <w:rFonts w:asciiTheme="minorHAnsi" w:hAnsiTheme="minorHAnsi" w:cstheme="minorHAnsi"/>
-          <w:sz w:val="20"/>
-          <w:szCs w:val="20"/>
-        </w:rPr>
-        <w:t>pct</w:t>
-      </w:r>
-      <w:proofErr w:type="spellEnd"/>
+      <w:r>
+        <w:rPr>
+          <w:rFonts w:asciiTheme="minorHAnsi" w:hAnsiTheme="minorHAnsi" w:cstheme="minorHAnsi"/>
+          <w:sz w:val="20"/>
+          <w:szCs w:val="20"/>
+        </w:rPr>
+        <w:t>home_social_stress_pct</w:t>
+      </w:r>
       <w:r>
         <w:rPr>
           <w:rFonts w:asciiTheme="minorHAnsi" w:hAnsiTheme="minorHAnsi" w:cstheme="minorHAnsi"/>
@@ -5020,7 +4410,6 @@
         </w:rPr>
         <w:t xml:space="preserve"> %</w:t>
       </w:r>
-      <w:proofErr w:type="gramEnd"/>
       <w:r>
         <w:rPr>
           <w:rFonts w:asciiTheme="minorHAnsi" w:hAnsiTheme="minorHAnsi" w:cstheme="minorHAnsi"/>
@@ -5052,17 +4441,7 @@
           <w:sz w:val="20"/>
           <w:szCs w:val="20"/>
         </w:rPr>
-        <w:t xml:space="preserve">Work-Related </w:t>
-      </w:r>
-      <w:proofErr w:type="gramStart"/>
-      <w:r>
-        <w:rPr>
-          <w:rStyle w:val="Strong"/>
-          <w:rFonts w:asciiTheme="minorHAnsi" w:eastAsiaTheme="majorEastAsia" w:hAnsiTheme="minorHAnsi" w:cstheme="minorHAnsi"/>
-          <w:sz w:val="20"/>
-          <w:szCs w:val="20"/>
-        </w:rPr>
-        <w:t>Stress:</w:t>
+        <w:t>Work-Related Stress:</w:t>
       </w:r>
       <w:r>
         <w:rPr>
@@ -5080,26 +4459,14 @@
         </w:rPr>
         <w:t>{{</w:t>
       </w:r>
-      <w:proofErr w:type="spellStart"/>
-      <w:proofErr w:type="gramEnd"/>
-      <w:r>
-        <w:rPr>
-          <w:rFonts w:asciiTheme="minorHAnsi" w:hAnsiTheme="minorHAnsi" w:cstheme="minorHAnsi"/>
-          <w:sz w:val="20"/>
-          <w:szCs w:val="20"/>
-        </w:rPr>
-        <w:t>work_related_stress_</w:t>
-      </w:r>
-      <w:proofErr w:type="gramStart"/>
-      <w:r>
-        <w:rPr>
-          <w:rFonts w:asciiTheme="minorHAnsi" w:hAnsiTheme="minorHAnsi" w:cstheme="minorHAnsi"/>
-          <w:sz w:val="20"/>
-          <w:szCs w:val="20"/>
-        </w:rPr>
-        <w:t>pct</w:t>
-      </w:r>
-      <w:proofErr w:type="spellEnd"/>
+      <w:r>
+        <w:rPr>
+          <w:rFonts w:asciiTheme="minorHAnsi" w:hAnsiTheme="minorHAnsi" w:cstheme="minorHAnsi"/>
+          <w:sz w:val="20"/>
+          <w:szCs w:val="20"/>
+        </w:rPr>
+        <w:t>work_related_stress_pct</w:t>
+      </w:r>
       <w:r>
         <w:rPr>
           <w:rFonts w:asciiTheme="minorHAnsi" w:hAnsiTheme="minorHAnsi" w:cstheme="minorHAnsi"/>
@@ -5124,7 +4491,6 @@
         </w:rPr>
         <w:t>%</w:t>
       </w:r>
-      <w:proofErr w:type="gramEnd"/>
       <w:r>
         <w:rPr>
           <w:rFonts w:asciiTheme="minorHAnsi" w:hAnsiTheme="minorHAnsi" w:cstheme="minorHAnsi"/>
@@ -5193,9 +4559,8 @@
           <w:sz w:val="20"/>
           <w:szCs w:val="20"/>
         </w:rPr>
-        <w:t>Tobacco Use (Oral &amp; Smoking</w:t>
-      </w:r>
-      <w:proofErr w:type="gramStart"/>
+        <w:t>Tobacco Use (Oral &amp; Smoking):</w:t>
+      </w:r>
       <w:r>
         <w:rPr>
           <w:rStyle w:val="Strong"/>
@@ -5203,7 +4568,7 @@
           <w:sz w:val="20"/>
           <w:szCs w:val="20"/>
         </w:rPr>
-        <w:t>):</w:t>
+        <w:t xml:space="preserve"> </w:t>
       </w:r>
       <w:r>
         <w:rPr>
@@ -5212,7 +4577,7 @@
           <w:sz w:val="20"/>
           <w:szCs w:val="20"/>
         </w:rPr>
-        <w:t xml:space="preserve"> </w:t>
+        <w:t>{{</w:t>
       </w:r>
       <w:r>
         <w:rPr>
@@ -5221,10 +4586,8 @@
           <w:sz w:val="20"/>
           <w:szCs w:val="20"/>
         </w:rPr>
-        <w:t>{{</w:t>
-      </w:r>
-      <w:proofErr w:type="spellStart"/>
-      <w:proofErr w:type="gramEnd"/>
+        <w:t>tobacco_use_pct</w:t>
+      </w:r>
       <w:r>
         <w:rPr>
           <w:rStyle w:val="Strong"/>
@@ -5232,9 +4595,8 @@
           <w:sz w:val="20"/>
           <w:szCs w:val="20"/>
         </w:rPr>
-        <w:t>tobacco_use_</w:t>
-      </w:r>
-      <w:proofErr w:type="gramStart"/>
+        <w:t>}}</w:t>
+      </w:r>
       <w:r>
         <w:rPr>
           <w:rStyle w:val="Strong"/>
@@ -5242,28 +4604,8 @@
           <w:sz w:val="20"/>
           <w:szCs w:val="20"/>
         </w:rPr>
-        <w:t>pct</w:t>
-      </w:r>
-      <w:proofErr w:type="spellEnd"/>
-      <w:r>
-        <w:rPr>
-          <w:rStyle w:val="Strong"/>
-          <w:rFonts w:asciiTheme="minorHAnsi" w:eastAsiaTheme="majorEastAsia" w:hAnsiTheme="minorHAnsi" w:cstheme="minorHAnsi"/>
-          <w:sz w:val="20"/>
-          <w:szCs w:val="20"/>
-        </w:rPr>
-        <w:t>}}</w:t>
-      </w:r>
-      <w:r>
-        <w:rPr>
-          <w:rStyle w:val="Strong"/>
-          <w:rFonts w:asciiTheme="minorHAnsi" w:eastAsiaTheme="majorEastAsia" w:hAnsiTheme="minorHAnsi" w:cstheme="minorHAnsi"/>
-          <w:sz w:val="20"/>
-          <w:szCs w:val="20"/>
-        </w:rPr>
         <w:t xml:space="preserve"> %</w:t>
       </w:r>
-      <w:proofErr w:type="gramEnd"/>
       <w:r>
         <w:rPr>
           <w:rStyle w:val="Strong"/>
@@ -5308,9 +4650,8 @@
           <w:sz w:val="20"/>
           <w:szCs w:val="20"/>
         </w:rPr>
-        <w:t xml:space="preserve">Alcohol </w:t>
-      </w:r>
-      <w:proofErr w:type="gramStart"/>
+        <w:t>Alcohol Consumption:</w:t>
+      </w:r>
       <w:r>
         <w:rPr>
           <w:rStyle w:val="Strong"/>
@@ -5318,7 +4659,7 @@
           <w:sz w:val="20"/>
           <w:szCs w:val="20"/>
         </w:rPr>
-        <w:t>Consumption:</w:t>
+        <w:t xml:space="preserve"> </w:t>
       </w:r>
       <w:r>
         <w:rPr>
@@ -5327,7 +4668,7 @@
           <w:sz w:val="20"/>
           <w:szCs w:val="20"/>
         </w:rPr>
-        <w:t xml:space="preserve"> </w:t>
+        <w:t>{{</w:t>
       </w:r>
       <w:r>
         <w:rPr>
@@ -5336,9 +4677,8 @@
           <w:sz w:val="20"/>
           <w:szCs w:val="20"/>
         </w:rPr>
-        <w:t>{{</w:t>
-      </w:r>
-      <w:proofErr w:type="spellStart"/>
+        <w:t>alcohol_consumption_pct</w:t>
+      </w:r>
       <w:r>
         <w:rPr>
           <w:rStyle w:val="Strong"/>
@@ -5346,9 +4686,8 @@
           <w:sz w:val="20"/>
           <w:szCs w:val="20"/>
         </w:rPr>
-        <w:t>alcohol</w:t>
-      </w:r>
-      <w:proofErr w:type="gramEnd"/>
+        <w:t>}}</w:t>
+      </w:r>
       <w:r>
         <w:rPr>
           <w:rStyle w:val="Strong"/>
@@ -5356,29 +4695,8 @@
           <w:sz w:val="20"/>
           <w:szCs w:val="20"/>
         </w:rPr>
-        <w:t>_consumption_pct</w:t>
-      </w:r>
-      <w:proofErr w:type="spellEnd"/>
-      <w:proofErr w:type="gramStart"/>
-      <w:r>
-        <w:rPr>
-          <w:rStyle w:val="Strong"/>
-          <w:rFonts w:asciiTheme="minorHAnsi" w:eastAsiaTheme="majorEastAsia" w:hAnsiTheme="minorHAnsi" w:cstheme="minorHAnsi"/>
-          <w:sz w:val="20"/>
-          <w:szCs w:val="20"/>
-        </w:rPr>
-        <w:t>}}</w:t>
-      </w:r>
-      <w:r>
-        <w:rPr>
-          <w:rStyle w:val="Strong"/>
-          <w:rFonts w:asciiTheme="minorHAnsi" w:eastAsiaTheme="majorEastAsia" w:hAnsiTheme="minorHAnsi" w:cstheme="minorHAnsi"/>
-          <w:sz w:val="20"/>
-          <w:szCs w:val="20"/>
-        </w:rPr>
         <w:t>%</w:t>
       </w:r>
-      <w:proofErr w:type="gramEnd"/>
       <w:r>
         <w:rPr>
           <w:rFonts w:asciiTheme="minorHAnsi" w:hAnsiTheme="minorHAnsi" w:cstheme="minorHAnsi"/>
@@ -5541,18 +4859,7 @@
           <w:sz w:val="20"/>
           <w:szCs w:val="20"/>
         </w:rPr>
-        <w:t xml:space="preserve">Chronic </w:t>
-      </w:r>
-      <w:proofErr w:type="gramStart"/>
-      <w:r>
-        <w:rPr>
-          <w:rFonts w:asciiTheme="minorHAnsi" w:hAnsiTheme="minorHAnsi" w:cstheme="minorHAnsi"/>
-          <w:b/>
-          <w:bCs/>
-          <w:sz w:val="20"/>
-          <w:szCs w:val="20"/>
-        </w:rPr>
-        <w:t>Ailments</w:t>
+        <w:t>Chronic Ailments</w:t>
       </w:r>
       <w:r>
         <w:rPr>
@@ -5570,26 +4877,14 @@
         </w:rPr>
         <w:t>{{</w:t>
       </w:r>
-      <w:proofErr w:type="spellStart"/>
-      <w:proofErr w:type="gramEnd"/>
-      <w:r>
-        <w:rPr>
-          <w:rFonts w:asciiTheme="minorHAnsi" w:hAnsiTheme="minorHAnsi" w:cstheme="minorHAnsi"/>
-          <w:sz w:val="20"/>
-          <w:szCs w:val="20"/>
-        </w:rPr>
-        <w:t>chronic_ailments_</w:t>
-      </w:r>
-      <w:proofErr w:type="gramStart"/>
-      <w:r>
-        <w:rPr>
-          <w:rFonts w:asciiTheme="minorHAnsi" w:hAnsiTheme="minorHAnsi" w:cstheme="minorHAnsi"/>
-          <w:sz w:val="20"/>
-          <w:szCs w:val="20"/>
-        </w:rPr>
-        <w:t>pct</w:t>
-      </w:r>
-      <w:proofErr w:type="spellEnd"/>
+      <w:r>
+        <w:rPr>
+          <w:rFonts w:asciiTheme="minorHAnsi" w:hAnsiTheme="minorHAnsi" w:cstheme="minorHAnsi"/>
+          <w:sz w:val="20"/>
+          <w:szCs w:val="20"/>
+        </w:rPr>
+        <w:t>chronic_ailments_pct</w:t>
+      </w:r>
       <w:r>
         <w:rPr>
           <w:rFonts w:asciiTheme="minorHAnsi" w:hAnsiTheme="minorHAnsi" w:cstheme="minorHAnsi"/>
@@ -5612,16 +4907,7 @@
           <w:sz w:val="20"/>
           <w:szCs w:val="20"/>
         </w:rPr>
-        <w:t>%</w:t>
-      </w:r>
-      <w:proofErr w:type="gramEnd"/>
-      <w:r>
-        <w:rPr>
-          <w:rFonts w:asciiTheme="minorHAnsi" w:hAnsiTheme="minorHAnsi" w:cstheme="minorHAnsi"/>
-          <w:sz w:val="20"/>
-          <w:szCs w:val="20"/>
-        </w:rPr>
-        <w:t xml:space="preserve"> of your employees indicate to suffer from chronic health issues</w:t>
+        <w:t>% of your employees indicate to suffer from chronic health issues</w:t>
       </w:r>
       <w:r>
         <w:rPr>
@@ -5659,7 +4945,6 @@
           <w:szCs w:val="20"/>
         </w:rPr>
       </w:pPr>
-      <w:proofErr w:type="gramStart"/>
       <w:r>
         <w:rPr>
           <w:rFonts w:asciiTheme="minorHAnsi" w:hAnsiTheme="minorHAnsi" w:cstheme="minorHAnsi"/>
@@ -5689,7 +4974,6 @@
         </w:rPr>
         <w:t>{{</w:t>
       </w:r>
-      <w:proofErr w:type="spellStart"/>
       <w:r>
         <w:rPr>
           <w:rFonts w:asciiTheme="minorHAnsi" w:hAnsiTheme="minorHAnsi" w:cstheme="minorHAnsi"/>
@@ -5698,9 +4982,8 @@
           <w:sz w:val="20"/>
           <w:szCs w:val="20"/>
         </w:rPr>
-        <w:t>medication</w:t>
-      </w:r>
-      <w:proofErr w:type="gramEnd"/>
+        <w:t>medication_total_pct</w:t>
+      </w:r>
       <w:r>
         <w:rPr>
           <w:rFonts w:asciiTheme="minorHAnsi" w:hAnsiTheme="minorHAnsi" w:cstheme="minorHAnsi"/>
@@ -5709,28 +4992,6 @@
           <w:sz w:val="20"/>
           <w:szCs w:val="20"/>
         </w:rPr>
-        <w:t>_total_</w:t>
-      </w:r>
-      <w:proofErr w:type="gramStart"/>
-      <w:r>
-        <w:rPr>
-          <w:rFonts w:asciiTheme="minorHAnsi" w:hAnsiTheme="minorHAnsi" w:cstheme="minorHAnsi"/>
-          <w:bCs/>
-          <w:spacing w:val="-2"/>
-          <w:sz w:val="20"/>
-          <w:szCs w:val="20"/>
-        </w:rPr>
-        <w:t>pct</w:t>
-      </w:r>
-      <w:proofErr w:type="spellEnd"/>
-      <w:r>
-        <w:rPr>
-          <w:rFonts w:asciiTheme="minorHAnsi" w:hAnsiTheme="minorHAnsi" w:cstheme="minorHAnsi"/>
-          <w:bCs/>
-          <w:spacing w:val="-2"/>
-          <w:sz w:val="20"/>
-          <w:szCs w:val="20"/>
-        </w:rPr>
         <w:t>}}</w:t>
       </w:r>
       <w:r>
@@ -5750,7 +5011,6 @@
         </w:rPr>
         <w:t>%</w:t>
       </w:r>
-      <w:proofErr w:type="gramEnd"/>
       <w:r>
         <w:rPr>
           <w:rFonts w:asciiTheme="minorHAnsi" w:hAnsiTheme="minorHAnsi" w:cstheme="minorHAnsi"/>
@@ -5914,25 +5174,14 @@
         </w:rPr>
         <w:t>{{</w:t>
       </w:r>
-      <w:proofErr w:type="spellStart"/>
-      <w:r>
-        <w:rPr>
-          <w:rFonts w:asciiTheme="minorHAnsi" w:hAnsiTheme="minorHAnsi" w:cstheme="minorHAnsi"/>
-          <w:sz w:val="20"/>
-          <w:szCs w:val="20"/>
-        </w:rPr>
-        <w:t>medication_diabetes_</w:t>
-      </w:r>
-      <w:proofErr w:type="gramStart"/>
-      <w:r>
-        <w:rPr>
-          <w:rFonts w:asciiTheme="minorHAnsi" w:hAnsiTheme="minorHAnsi" w:cstheme="minorHAnsi"/>
-          <w:sz w:val="20"/>
-          <w:szCs w:val="20"/>
-        </w:rPr>
-        <w:t>pct</w:t>
-      </w:r>
-      <w:proofErr w:type="spellEnd"/>
+      <w:r>
+        <w:rPr>
+          <w:rFonts w:asciiTheme="minorHAnsi" w:hAnsiTheme="minorHAnsi" w:cstheme="minorHAnsi"/>
+          <w:sz w:val="20"/>
+          <w:szCs w:val="20"/>
+        </w:rPr>
+        <w:t>medication_diabetes_pct</w:t>
+      </w:r>
       <w:r>
         <w:rPr>
           <w:rFonts w:asciiTheme="minorHAnsi" w:hAnsiTheme="minorHAnsi" w:cstheme="minorHAnsi"/>
@@ -5957,7 +5206,6 @@
         </w:rPr>
         <w:t>%</w:t>
       </w:r>
-      <w:proofErr w:type="gramEnd"/>
       <w:r>
         <w:rPr>
           <w:rFonts w:asciiTheme="minorHAnsi" w:hAnsiTheme="minorHAnsi" w:cstheme="minorHAnsi"/>
@@ -6079,25 +5327,14 @@
         </w:rPr>
         <w:t>{{</w:t>
       </w:r>
-      <w:proofErr w:type="spellStart"/>
-      <w:r>
-        <w:rPr>
-          <w:rFonts w:asciiTheme="minorHAnsi" w:hAnsiTheme="minorHAnsi" w:cstheme="minorHAnsi"/>
-          <w:sz w:val="20"/>
-          <w:szCs w:val="20"/>
-        </w:rPr>
-        <w:t>medication_hypertension_</w:t>
-      </w:r>
-      <w:proofErr w:type="gramStart"/>
-      <w:r>
-        <w:rPr>
-          <w:rFonts w:asciiTheme="minorHAnsi" w:hAnsiTheme="minorHAnsi" w:cstheme="minorHAnsi"/>
-          <w:sz w:val="20"/>
-          <w:szCs w:val="20"/>
-        </w:rPr>
-        <w:t>pct</w:t>
-      </w:r>
-      <w:proofErr w:type="spellEnd"/>
+      <w:r>
+        <w:rPr>
+          <w:rFonts w:asciiTheme="minorHAnsi" w:hAnsiTheme="minorHAnsi" w:cstheme="minorHAnsi"/>
+          <w:sz w:val="20"/>
+          <w:szCs w:val="20"/>
+        </w:rPr>
+        <w:t>medication_hypertension_pct</w:t>
+      </w:r>
       <w:r>
         <w:rPr>
           <w:rFonts w:asciiTheme="minorHAnsi" w:hAnsiTheme="minorHAnsi" w:cstheme="minorHAnsi"/>
@@ -6122,7 +5359,6 @@
         </w:rPr>
         <w:t>%</w:t>
       </w:r>
-      <w:proofErr w:type="gramEnd"/>
       <w:r>
         <w:rPr>
           <w:rFonts w:asciiTheme="minorHAnsi" w:hAnsiTheme="minorHAnsi" w:cstheme="minorHAnsi"/>
@@ -6244,25 +5480,14 @@
         </w:rPr>
         <w:t>{{</w:t>
       </w:r>
-      <w:proofErr w:type="spellStart"/>
-      <w:r>
-        <w:rPr>
-          <w:rFonts w:asciiTheme="minorHAnsi" w:hAnsiTheme="minorHAnsi" w:cstheme="minorHAnsi"/>
-          <w:sz w:val="20"/>
-          <w:szCs w:val="20"/>
-        </w:rPr>
-        <w:t>medication_dyslipidemia_</w:t>
-      </w:r>
-      <w:proofErr w:type="gramStart"/>
-      <w:r>
-        <w:rPr>
-          <w:rFonts w:asciiTheme="minorHAnsi" w:hAnsiTheme="minorHAnsi" w:cstheme="minorHAnsi"/>
-          <w:sz w:val="20"/>
-          <w:szCs w:val="20"/>
-        </w:rPr>
-        <w:t>pct</w:t>
-      </w:r>
-      <w:proofErr w:type="spellEnd"/>
+      <w:r>
+        <w:rPr>
+          <w:rFonts w:asciiTheme="minorHAnsi" w:hAnsiTheme="minorHAnsi" w:cstheme="minorHAnsi"/>
+          <w:sz w:val="20"/>
+          <w:szCs w:val="20"/>
+        </w:rPr>
+        <w:t>medication_dyslipidemia_pct</w:t>
+      </w:r>
       <w:r>
         <w:rPr>
           <w:rFonts w:asciiTheme="minorHAnsi" w:hAnsiTheme="minorHAnsi" w:cstheme="minorHAnsi"/>
@@ -6287,7 +5512,6 @@
         </w:rPr>
         <w:t>%</w:t>
       </w:r>
-      <w:proofErr w:type="gramEnd"/>
       <w:r>
         <w:rPr>
           <w:rFonts w:asciiTheme="minorHAnsi" w:hAnsiTheme="minorHAnsi" w:cstheme="minorHAnsi"/>
@@ -6409,25 +5633,14 @@
         </w:rPr>
         <w:t>{{</w:t>
       </w:r>
-      <w:proofErr w:type="spellStart"/>
-      <w:r>
-        <w:rPr>
-          <w:rFonts w:asciiTheme="minorHAnsi" w:hAnsiTheme="minorHAnsi" w:cstheme="minorHAnsi"/>
-          <w:sz w:val="20"/>
-          <w:szCs w:val="20"/>
-        </w:rPr>
-        <w:t>medication_musculoskeletal_</w:t>
-      </w:r>
-      <w:proofErr w:type="gramStart"/>
-      <w:r>
-        <w:rPr>
-          <w:rFonts w:asciiTheme="minorHAnsi" w:hAnsiTheme="minorHAnsi" w:cstheme="minorHAnsi"/>
-          <w:sz w:val="20"/>
-          <w:szCs w:val="20"/>
-        </w:rPr>
-        <w:t>pct</w:t>
-      </w:r>
-      <w:proofErr w:type="spellEnd"/>
+      <w:r>
+        <w:rPr>
+          <w:rFonts w:asciiTheme="minorHAnsi" w:hAnsiTheme="minorHAnsi" w:cstheme="minorHAnsi"/>
+          <w:sz w:val="20"/>
+          <w:szCs w:val="20"/>
+        </w:rPr>
+        <w:t>medication_musculoskeletal_pct</w:t>
+      </w:r>
       <w:r>
         <w:rPr>
           <w:rFonts w:asciiTheme="minorHAnsi" w:hAnsiTheme="minorHAnsi" w:cstheme="minorHAnsi"/>
@@ -6452,7 +5665,6 @@
         </w:rPr>
         <w:t>%</w:t>
       </w:r>
-      <w:proofErr w:type="gramEnd"/>
       <w:r>
         <w:rPr>
           <w:rFonts w:asciiTheme="minorHAnsi" w:hAnsiTheme="minorHAnsi" w:cstheme="minorHAnsi"/>
@@ -6544,25 +5756,7 @@
           <w:sz w:val="20"/>
           <w:szCs w:val="20"/>
         </w:rPr>
-        <w:t xml:space="preserve"> medication for </w:t>
-      </w:r>
-      <w:proofErr w:type="spellStart"/>
-      <w:r>
-        <w:rPr>
-          <w:rFonts w:asciiTheme="minorHAnsi" w:hAnsiTheme="minorHAnsi" w:cstheme="minorHAnsi"/>
-          <w:sz w:val="20"/>
-          <w:szCs w:val="20"/>
-        </w:rPr>
-        <w:t>musculo</w:t>
-      </w:r>
-      <w:proofErr w:type="spellEnd"/>
-      <w:r>
-        <w:rPr>
-          <w:rFonts w:asciiTheme="minorHAnsi" w:hAnsiTheme="minorHAnsi" w:cstheme="minorHAnsi"/>
-          <w:sz w:val="20"/>
-          <w:szCs w:val="20"/>
-        </w:rPr>
-        <w:t>-skeletal problems.</w:t>
+        <w:t xml:space="preserve"> medication for musculo-skeletal problems.</w:t>
       </w:r>
     </w:p>
     <w:p>
@@ -6593,25 +5787,14 @@
         <w:lastRenderedPageBreak/>
         <w:t>{{</w:t>
       </w:r>
-      <w:proofErr w:type="spellStart"/>
-      <w:r>
-        <w:rPr>
-          <w:rFonts w:asciiTheme="minorHAnsi" w:hAnsiTheme="minorHAnsi" w:cstheme="minorHAnsi"/>
-          <w:sz w:val="20"/>
-          <w:szCs w:val="20"/>
-        </w:rPr>
-        <w:t>medication_other_</w:t>
-      </w:r>
-      <w:proofErr w:type="gramStart"/>
-      <w:r>
-        <w:rPr>
-          <w:rFonts w:asciiTheme="minorHAnsi" w:hAnsiTheme="minorHAnsi" w:cstheme="minorHAnsi"/>
-          <w:sz w:val="20"/>
-          <w:szCs w:val="20"/>
-        </w:rPr>
-        <w:t>pct</w:t>
-      </w:r>
-      <w:proofErr w:type="spellEnd"/>
+      <w:r>
+        <w:rPr>
+          <w:rFonts w:asciiTheme="minorHAnsi" w:hAnsiTheme="minorHAnsi" w:cstheme="minorHAnsi"/>
+          <w:sz w:val="20"/>
+          <w:szCs w:val="20"/>
+        </w:rPr>
+        <w:t>medication_other_pct</w:t>
+      </w:r>
       <w:r>
         <w:rPr>
           <w:rFonts w:asciiTheme="minorHAnsi" w:hAnsiTheme="minorHAnsi" w:cstheme="minorHAnsi"/>
@@ -6636,7 +5819,6 @@
         </w:rPr>
         <w:t>%</w:t>
       </w:r>
-      <w:proofErr w:type="gramEnd"/>
       <w:r>
         <w:rPr>
           <w:rFonts w:asciiTheme="minorHAnsi" w:hAnsiTheme="minorHAnsi" w:cstheme="minorHAnsi"/>
@@ -6796,31 +5978,7 @@
           <w:sz w:val="20"/>
           <w:szCs w:val="20"/>
         </w:rPr>
-        <w:t xml:space="preserve">(will be displayed according to test </w:t>
-      </w:r>
-      <w:proofErr w:type="gramStart"/>
-      <w:r>
-        <w:rPr>
-          <w:rFonts w:asciiTheme="minorHAnsi" w:hAnsiTheme="minorHAnsi" w:cstheme="minorHAnsi"/>
-          <w:bCs/>
-          <w:color w:val="0070C0"/>
-          <w:spacing w:val="-2"/>
-          <w:sz w:val="20"/>
-          <w:szCs w:val="20"/>
-        </w:rPr>
-        <w:t>done:</w:t>
-      </w:r>
-      <w:proofErr w:type="gramEnd"/>
-      <w:r>
-        <w:rPr>
-          <w:rFonts w:asciiTheme="minorHAnsi" w:hAnsiTheme="minorHAnsi" w:cstheme="minorHAnsi"/>
-          <w:bCs/>
-          <w:color w:val="0070C0"/>
-          <w:spacing w:val="-2"/>
-          <w:sz w:val="20"/>
-          <w:szCs w:val="20"/>
-        </w:rPr>
-        <w:t xml:space="preserve"> </w:t>
+        <w:t xml:space="preserve">(will be displayed according to test done: </w:t>
       </w:r>
       <w:r>
         <w:rPr>
@@ -6972,7 +6130,6 @@
         </w:rPr>
         <w:t>{{</w:t>
       </w:r>
-      <w:proofErr w:type="spellStart"/>
       <w:r>
         <w:rPr>
           <w:rFonts w:asciiTheme="minorHAnsi" w:hAnsiTheme="minorHAnsi" w:cstheme="minorHAnsi"/>
@@ -6980,19 +6137,8 @@
           <w:szCs w:val="20"/>
           <w:lang w:val="en-AE"/>
         </w:rPr>
-        <w:t>fbs_pre_</w:t>
-      </w:r>
-      <w:proofErr w:type="gramStart"/>
-      <w:r>
-        <w:rPr>
-          <w:rFonts w:asciiTheme="minorHAnsi" w:hAnsiTheme="minorHAnsi" w:cstheme="minorHAnsi"/>
-          <w:sz w:val="20"/>
-          <w:szCs w:val="20"/>
-          <w:lang w:val="en-AE"/>
-        </w:rPr>
-        <w:t>pct</w:t>
-      </w:r>
-      <w:proofErr w:type="spellEnd"/>
+        <w:t>fbs_pre_pct</w:t>
+      </w:r>
       <w:r>
         <w:rPr>
           <w:rFonts w:asciiTheme="minorHAnsi" w:hAnsiTheme="minorHAnsi" w:cstheme="minorHAnsi"/>
@@ -7009,7 +6155,6 @@
         </w:rPr>
         <w:t xml:space="preserve"> %</w:t>
       </w:r>
-      <w:proofErr w:type="gramEnd"/>
       <w:r>
         <w:rPr>
           <w:rFonts w:asciiTheme="minorHAnsi" w:hAnsiTheme="minorHAnsi" w:cstheme="minorHAnsi"/>
@@ -7170,19 +6315,8 @@
           <w:sz w:val="20"/>
           <w:szCs w:val="20"/>
         </w:rPr>
-        <w:t xml:space="preserve"> </w:t>
-      </w:r>
-      <w:proofErr w:type="gramStart"/>
-      <w:r>
-        <w:rPr>
-          <w:rFonts w:asciiTheme="minorHAnsi" w:hAnsiTheme="minorHAnsi" w:cstheme="minorHAnsi"/>
-          <w:spacing w:val="-1"/>
-          <w:sz w:val="20"/>
-          <w:szCs w:val="20"/>
-        </w:rPr>
-        <w:t>Fasting Blood Glucose levels</w:t>
-      </w:r>
-      <w:proofErr w:type="gramEnd"/>
+        <w:t xml:space="preserve"> Fasting Blood Glucose levels</w:t>
+      </w:r>
       <w:r>
         <w:rPr>
           <w:rFonts w:asciiTheme="minorHAnsi" w:hAnsiTheme="minorHAnsi" w:cstheme="minorHAnsi"/>
@@ -7236,7 +6370,6 @@
         </w:rPr>
         <w:t>{{</w:t>
       </w:r>
-      <w:proofErr w:type="spellStart"/>
       <w:r>
         <w:rPr>
           <w:rFonts w:asciiTheme="minorHAnsi" w:hAnsiTheme="minorHAnsi" w:cstheme="minorHAnsi"/>
@@ -7244,19 +6377,8 @@
           <w:szCs w:val="20"/>
           <w:lang w:val="en-AE"/>
         </w:rPr>
-        <w:t>fbs_mod_</w:t>
-      </w:r>
-      <w:proofErr w:type="gramStart"/>
-      <w:r>
-        <w:rPr>
-          <w:rFonts w:asciiTheme="minorHAnsi" w:hAnsiTheme="minorHAnsi" w:cstheme="minorHAnsi"/>
-          <w:sz w:val="20"/>
-          <w:szCs w:val="20"/>
-          <w:lang w:val="en-AE"/>
-        </w:rPr>
-        <w:t>pct</w:t>
-      </w:r>
-      <w:proofErr w:type="spellEnd"/>
+        <w:t>fbs_mod_pct</w:t>
+      </w:r>
       <w:r>
         <w:rPr>
           <w:rFonts w:asciiTheme="minorHAnsi" w:hAnsiTheme="minorHAnsi" w:cstheme="minorHAnsi"/>
@@ -7273,7 +6395,6 @@
         </w:rPr>
         <w:t xml:space="preserve"> %</w:t>
       </w:r>
-      <w:proofErr w:type="gramEnd"/>
       <w:r>
         <w:rPr>
           <w:rFonts w:asciiTheme="minorHAnsi" w:hAnsiTheme="minorHAnsi" w:cstheme="minorHAnsi"/>
@@ -7430,7 +6551,6 @@
         </w:rPr>
         <w:t>{{</w:t>
       </w:r>
-      <w:proofErr w:type="spellStart"/>
       <w:r>
         <w:rPr>
           <w:rFonts w:asciiTheme="minorHAnsi" w:hAnsiTheme="minorHAnsi" w:cstheme="minorHAnsi"/>
@@ -7438,19 +6558,8 @@
           <w:szCs w:val="20"/>
           <w:lang w:val="en-AE"/>
         </w:rPr>
-        <w:t>fbs_dia_</w:t>
-      </w:r>
-      <w:proofErr w:type="gramStart"/>
-      <w:r>
-        <w:rPr>
-          <w:rFonts w:asciiTheme="minorHAnsi" w:hAnsiTheme="minorHAnsi" w:cstheme="minorHAnsi"/>
-          <w:sz w:val="20"/>
-          <w:szCs w:val="20"/>
-          <w:lang w:val="en-AE"/>
-        </w:rPr>
-        <w:t>pct</w:t>
-      </w:r>
-      <w:proofErr w:type="spellEnd"/>
+        <w:t>fbs_dia_pct</w:t>
+      </w:r>
       <w:r>
         <w:rPr>
           <w:rFonts w:asciiTheme="minorHAnsi" w:hAnsiTheme="minorHAnsi" w:cstheme="minorHAnsi"/>
@@ -7467,7 +6576,6 @@
         </w:rPr>
         <w:t xml:space="preserve"> %</w:t>
       </w:r>
-      <w:proofErr w:type="gramEnd"/>
       <w:r>
         <w:rPr>
           <w:rFonts w:asciiTheme="minorHAnsi" w:hAnsiTheme="minorHAnsi" w:cstheme="minorHAnsi"/>
@@ -7607,25 +6715,14 @@
         </w:rPr>
         <w:t>{{</w:t>
       </w:r>
-      <w:proofErr w:type="spellStart"/>
-      <w:r>
-        <w:rPr>
-          <w:rFonts w:asciiTheme="minorHAnsi" w:hAnsiTheme="minorHAnsi" w:cstheme="minorHAnsi"/>
-          <w:sz w:val="20"/>
-          <w:szCs w:val="20"/>
-        </w:rPr>
-        <w:t>rbs_pre_</w:t>
-      </w:r>
-      <w:proofErr w:type="gramStart"/>
-      <w:r>
-        <w:rPr>
-          <w:rFonts w:asciiTheme="minorHAnsi" w:hAnsiTheme="minorHAnsi" w:cstheme="minorHAnsi"/>
-          <w:sz w:val="20"/>
-          <w:szCs w:val="20"/>
-        </w:rPr>
-        <w:t>pct</w:t>
-      </w:r>
-      <w:proofErr w:type="spellEnd"/>
+      <w:r>
+        <w:rPr>
+          <w:rFonts w:asciiTheme="minorHAnsi" w:hAnsiTheme="minorHAnsi" w:cstheme="minorHAnsi"/>
+          <w:sz w:val="20"/>
+          <w:szCs w:val="20"/>
+        </w:rPr>
+        <w:t>rbs_pre_pct</w:t>
+      </w:r>
       <w:r>
         <w:rPr>
           <w:rFonts w:asciiTheme="minorHAnsi" w:hAnsiTheme="minorHAnsi" w:cstheme="minorHAnsi"/>
@@ -7650,7 +6747,6 @@
         </w:rPr>
         <w:t>%</w:t>
       </w:r>
-      <w:proofErr w:type="gramEnd"/>
       <w:r>
         <w:rPr>
           <w:rFonts w:asciiTheme="minorHAnsi" w:hAnsiTheme="minorHAnsi" w:cstheme="minorHAnsi"/>
@@ -7811,19 +6907,8 @@
           <w:sz w:val="20"/>
           <w:szCs w:val="20"/>
         </w:rPr>
-        <w:t xml:space="preserve"> </w:t>
-      </w:r>
-      <w:proofErr w:type="gramStart"/>
-      <w:r>
-        <w:rPr>
-          <w:rFonts w:asciiTheme="minorHAnsi" w:hAnsiTheme="minorHAnsi" w:cstheme="minorHAnsi"/>
-          <w:spacing w:val="-1"/>
-          <w:sz w:val="20"/>
-          <w:szCs w:val="20"/>
-        </w:rPr>
-        <w:t>Random Blood Glucose levels</w:t>
-      </w:r>
-      <w:proofErr w:type="gramEnd"/>
+        <w:t xml:space="preserve"> Random Blood Glucose levels</w:t>
+      </w:r>
       <w:r>
         <w:rPr>
           <w:rFonts w:asciiTheme="minorHAnsi" w:hAnsiTheme="minorHAnsi" w:cstheme="minorHAnsi"/>
@@ -7860,25 +6945,14 @@
         </w:rPr>
         <w:t>{{</w:t>
       </w:r>
-      <w:proofErr w:type="spellStart"/>
-      <w:r>
-        <w:rPr>
-          <w:rFonts w:asciiTheme="minorHAnsi" w:hAnsiTheme="minorHAnsi" w:cstheme="minorHAnsi"/>
-          <w:sz w:val="20"/>
-          <w:szCs w:val="20"/>
-        </w:rPr>
-        <w:t>rbs_mod_</w:t>
-      </w:r>
-      <w:proofErr w:type="gramStart"/>
-      <w:r>
-        <w:rPr>
-          <w:rFonts w:asciiTheme="minorHAnsi" w:hAnsiTheme="minorHAnsi" w:cstheme="minorHAnsi"/>
-          <w:sz w:val="20"/>
-          <w:szCs w:val="20"/>
-        </w:rPr>
-        <w:t>pct</w:t>
-      </w:r>
-      <w:proofErr w:type="spellEnd"/>
+      <w:r>
+        <w:rPr>
+          <w:rFonts w:asciiTheme="minorHAnsi" w:hAnsiTheme="minorHAnsi" w:cstheme="minorHAnsi"/>
+          <w:sz w:val="20"/>
+          <w:szCs w:val="20"/>
+        </w:rPr>
+        <w:t>rbs_mod_pct</w:t>
+      </w:r>
       <w:r>
         <w:rPr>
           <w:rFonts w:asciiTheme="minorHAnsi" w:hAnsiTheme="minorHAnsi" w:cstheme="minorHAnsi"/>
@@ -7903,7 +6977,6 @@
         </w:rPr>
         <w:t>%</w:t>
       </w:r>
-      <w:proofErr w:type="gramEnd"/>
       <w:r>
         <w:rPr>
           <w:rFonts w:asciiTheme="minorHAnsi" w:hAnsiTheme="minorHAnsi" w:cstheme="minorHAnsi"/>
@@ -8053,7 +7126,6 @@
         </w:rPr>
         <w:t>{{</w:t>
       </w:r>
-      <w:proofErr w:type="spellStart"/>
       <w:r>
         <w:rPr>
           <w:rFonts w:asciiTheme="minorHAnsi" w:hAnsiTheme="minorHAnsi" w:cstheme="minorHAnsi"/>
@@ -8061,9 +7133,8 @@
           <w:sz w:val="20"/>
           <w:szCs w:val="20"/>
         </w:rPr>
-        <w:t>rbs_dia_</w:t>
-      </w:r>
-      <w:proofErr w:type="gramStart"/>
+        <w:t>rbs_dia_pct</w:t>
+      </w:r>
       <w:r>
         <w:rPr>
           <w:rFonts w:asciiTheme="minorHAnsi" w:hAnsiTheme="minorHAnsi" w:cstheme="minorHAnsi"/>
@@ -8071,9 +7142,8 @@
           <w:sz w:val="20"/>
           <w:szCs w:val="20"/>
         </w:rPr>
-        <w:t>pct</w:t>
-      </w:r>
-      <w:proofErr w:type="spellEnd"/>
+        <w:t>}}</w:t>
+      </w:r>
       <w:r>
         <w:rPr>
           <w:rFonts w:asciiTheme="minorHAnsi" w:hAnsiTheme="minorHAnsi" w:cstheme="minorHAnsi"/>
@@ -8081,15 +7151,6 @@
           <w:sz w:val="20"/>
           <w:szCs w:val="20"/>
         </w:rPr>
-        <w:t>}}</w:t>
-      </w:r>
-      <w:r>
-        <w:rPr>
-          <w:rFonts w:asciiTheme="minorHAnsi" w:hAnsiTheme="minorHAnsi" w:cstheme="minorHAnsi"/>
-          <w:spacing w:val="-1"/>
-          <w:sz w:val="20"/>
-          <w:szCs w:val="20"/>
-        </w:rPr>
         <w:t xml:space="preserve"> </w:t>
       </w:r>
       <w:r>
@@ -8100,7 +7161,6 @@
         </w:rPr>
         <w:t>%</w:t>
       </w:r>
-      <w:proofErr w:type="gramEnd"/>
       <w:r>
         <w:rPr>
           <w:rFonts w:asciiTheme="minorHAnsi" w:hAnsiTheme="minorHAnsi" w:cstheme="minorHAnsi"/>
@@ -8413,7 +7473,6 @@
         </w:rPr>
         <w:t>{{</w:t>
       </w:r>
-      <w:proofErr w:type="spellStart"/>
       <w:r>
         <w:rPr>
           <w:rFonts w:asciiTheme="minorHAnsi" w:hAnsiTheme="minorHAnsi" w:cstheme="minorHAnsi"/>
@@ -8423,7 +7482,6 @@
         </w:rPr>
         <w:t>pre_hypertensive_pct</w:t>
       </w:r>
-      <w:proofErr w:type="spellEnd"/>
       <w:r>
         <w:rPr>
           <w:rFonts w:asciiTheme="minorHAnsi" w:hAnsiTheme="minorHAnsi" w:cstheme="minorHAnsi"/>
@@ -9265,9 +8323,8 @@
           <w:sz w:val="20"/>
           <w:szCs w:val="20"/>
         </w:rPr>
-        <w:t>gr3_hypertensive_</w:t>
-      </w:r>
-      <w:proofErr w:type="gramStart"/>
+        <w:t>gr3_hypertensive_pct</w:t>
+      </w:r>
       <w:r>
         <w:rPr>
           <w:rFonts w:asciiTheme="minorHAnsi" w:hAnsiTheme="minorHAnsi" w:cstheme="minorHAnsi"/>
@@ -9275,7 +8332,7 @@
           <w:sz w:val="20"/>
           <w:szCs w:val="20"/>
         </w:rPr>
-        <w:t>pct</w:t>
+        <w:t>}}</w:t>
       </w:r>
       <w:r>
         <w:rPr>
@@ -9284,15 +8341,6 @@
           <w:sz w:val="20"/>
           <w:szCs w:val="20"/>
         </w:rPr>
-        <w:t>}}</w:t>
-      </w:r>
-      <w:r>
-        <w:rPr>
-          <w:rFonts w:asciiTheme="minorHAnsi" w:hAnsiTheme="minorHAnsi" w:cstheme="minorHAnsi"/>
-          <w:spacing w:val="-1"/>
-          <w:sz w:val="20"/>
-          <w:szCs w:val="20"/>
-        </w:rPr>
         <w:t xml:space="preserve"> </w:t>
       </w:r>
       <w:r>
@@ -9303,7 +8351,6 @@
         </w:rPr>
         <w:t>%</w:t>
       </w:r>
-      <w:proofErr w:type="gramEnd"/>
       <w:r>
         <w:rPr>
           <w:rFonts w:asciiTheme="minorHAnsi" w:hAnsiTheme="minorHAnsi" w:cstheme="minorHAnsi"/>
@@ -9657,7 +8704,6 @@
         </w:rPr>
         <w:t>{{</w:t>
       </w:r>
-      <w:proofErr w:type="spellStart"/>
       <w:r>
         <w:rPr>
           <w:rFonts w:asciiTheme="minorHAnsi" w:hAnsiTheme="minorHAnsi" w:cstheme="minorHAnsi"/>
@@ -9665,9 +8711,8 @@
           <w:sz w:val="20"/>
           <w:szCs w:val="20"/>
         </w:rPr>
-        <w:t>borderline_hyperlipidemia_</w:t>
-      </w:r>
-      <w:proofErr w:type="gramStart"/>
+        <w:t>borderline_hyperlipidemia_pct</w:t>
+      </w:r>
       <w:r>
         <w:rPr>
           <w:rFonts w:asciiTheme="minorHAnsi" w:hAnsiTheme="minorHAnsi" w:cstheme="minorHAnsi"/>
@@ -9675,9 +8720,8 @@
           <w:sz w:val="20"/>
           <w:szCs w:val="20"/>
         </w:rPr>
-        <w:t>pct</w:t>
-      </w:r>
-      <w:proofErr w:type="spellEnd"/>
+        <w:t>}}</w:t>
+      </w:r>
       <w:r>
         <w:rPr>
           <w:rFonts w:asciiTheme="minorHAnsi" w:hAnsiTheme="minorHAnsi" w:cstheme="minorHAnsi"/>
@@ -9685,15 +8729,6 @@
           <w:sz w:val="20"/>
           <w:szCs w:val="20"/>
         </w:rPr>
-        <w:t>}}</w:t>
-      </w:r>
-      <w:r>
-        <w:rPr>
-          <w:rFonts w:asciiTheme="minorHAnsi" w:hAnsiTheme="minorHAnsi" w:cstheme="minorHAnsi"/>
-          <w:spacing w:val="-1"/>
-          <w:sz w:val="20"/>
-          <w:szCs w:val="20"/>
-        </w:rPr>
         <w:t xml:space="preserve"> </w:t>
       </w:r>
       <w:r>
@@ -9704,7 +8739,6 @@
         </w:rPr>
         <w:t>%</w:t>
       </w:r>
-      <w:proofErr w:type="gramEnd"/>
       <w:r>
         <w:rPr>
           <w:rFonts w:asciiTheme="minorHAnsi" w:hAnsiTheme="minorHAnsi" w:cstheme="minorHAnsi"/>
@@ -9861,7 +8895,6 @@
         </w:rPr>
         <w:t>{{</w:t>
       </w:r>
-      <w:proofErr w:type="spellStart"/>
       <w:r>
         <w:rPr>
           <w:rFonts w:asciiTheme="minorHAnsi" w:hAnsiTheme="minorHAnsi" w:cstheme="minorHAnsi"/>
@@ -9870,7 +8903,6 @@
         </w:rPr>
         <w:t>moderate_hyperlipidemia_pct</w:t>
       </w:r>
-      <w:proofErr w:type="spellEnd"/>
       <w:r>
         <w:rPr>
           <w:rFonts w:asciiTheme="minorHAnsi" w:hAnsiTheme="minorHAnsi" w:cstheme="minorHAnsi"/>
@@ -10034,25 +9066,14 @@
         </w:rPr>
         <w:t>{{</w:t>
       </w:r>
-      <w:proofErr w:type="spellStart"/>
-      <w:r>
-        <w:rPr>
-          <w:rFonts w:asciiTheme="minorHAnsi" w:hAnsiTheme="minorHAnsi" w:cstheme="minorHAnsi"/>
-          <w:sz w:val="20"/>
-          <w:szCs w:val="20"/>
-        </w:rPr>
-        <w:t>hyperlipidemia_</w:t>
-      </w:r>
-      <w:proofErr w:type="gramStart"/>
-      <w:r>
-        <w:rPr>
-          <w:rFonts w:asciiTheme="minorHAnsi" w:hAnsiTheme="minorHAnsi" w:cstheme="minorHAnsi"/>
-          <w:sz w:val="20"/>
-          <w:szCs w:val="20"/>
-        </w:rPr>
-        <w:t>pct</w:t>
-      </w:r>
-      <w:proofErr w:type="spellEnd"/>
+      <w:r>
+        <w:rPr>
+          <w:rFonts w:asciiTheme="minorHAnsi" w:hAnsiTheme="minorHAnsi" w:cstheme="minorHAnsi"/>
+          <w:sz w:val="20"/>
+          <w:szCs w:val="20"/>
+        </w:rPr>
+        <w:t>hyperlipidemia_pct</w:t>
+      </w:r>
       <w:r>
         <w:rPr>
           <w:rFonts w:asciiTheme="minorHAnsi" w:hAnsiTheme="minorHAnsi" w:cstheme="minorHAnsi"/>
@@ -10077,7 +9098,6 @@
         </w:rPr>
         <w:t>%</w:t>
       </w:r>
-      <w:proofErr w:type="gramEnd"/>
       <w:r>
         <w:rPr>
           <w:rFonts w:asciiTheme="minorHAnsi" w:hAnsiTheme="minorHAnsi" w:cstheme="minorHAnsi"/>
@@ -10266,25 +9286,14 @@
         </w:rPr>
         <w:t>{{</w:t>
       </w:r>
-      <w:proofErr w:type="spellStart"/>
-      <w:r>
-        <w:rPr>
-          <w:rFonts w:asciiTheme="minorHAnsi" w:hAnsiTheme="minorHAnsi" w:cstheme="minorHAnsi"/>
-          <w:sz w:val="20"/>
-          <w:szCs w:val="20"/>
-        </w:rPr>
-        <w:t>cardiac_risk_</w:t>
-      </w:r>
-      <w:proofErr w:type="gramStart"/>
-      <w:r>
-        <w:rPr>
-          <w:rFonts w:asciiTheme="minorHAnsi" w:hAnsiTheme="minorHAnsi" w:cstheme="minorHAnsi"/>
-          <w:sz w:val="20"/>
-          <w:szCs w:val="20"/>
-        </w:rPr>
-        <w:t>pct</w:t>
-      </w:r>
-      <w:proofErr w:type="spellEnd"/>
+      <w:r>
+        <w:rPr>
+          <w:rFonts w:asciiTheme="minorHAnsi" w:hAnsiTheme="minorHAnsi" w:cstheme="minorHAnsi"/>
+          <w:sz w:val="20"/>
+          <w:szCs w:val="20"/>
+        </w:rPr>
+        <w:t>cardiac_risk_pct</w:t>
+      </w:r>
       <w:r>
         <w:rPr>
           <w:rFonts w:asciiTheme="minorHAnsi" w:hAnsiTheme="minorHAnsi" w:cstheme="minorHAnsi"/>
@@ -10310,7 +9319,6 @@
         </w:rPr>
         <w:t>%</w:t>
       </w:r>
-      <w:proofErr w:type="gramEnd"/>
       <w:r>
         <w:rPr>
           <w:rFonts w:asciiTheme="minorHAnsi" w:hAnsiTheme="minorHAnsi" w:cstheme="minorHAnsi"/>
@@ -10439,7 +9447,6 @@
         </w:rPr>
         <w:t xml:space="preserve"> </w:t>
       </w:r>
-      <w:proofErr w:type="gramStart"/>
       <w:r>
         <w:rPr>
           <w:rFonts w:asciiTheme="minorHAnsi" w:hAnsiTheme="minorHAnsi" w:cstheme="minorHAnsi"/>
@@ -10473,7 +9480,6 @@
         </w:rPr>
         <w:t>consequence</w:t>
       </w:r>
-      <w:proofErr w:type="gramEnd"/>
       <w:r>
         <w:rPr>
           <w:rFonts w:asciiTheme="minorHAnsi" w:hAnsiTheme="minorHAnsi" w:cstheme="minorHAnsi"/>
@@ -11084,7 +10090,6 @@
         </w:rPr>
         <w:t xml:space="preserve"> </w:t>
       </w:r>
-      <w:proofErr w:type="gramStart"/>
       <w:r>
         <w:rPr>
           <w:rFonts w:asciiTheme="minorHAnsi" w:hAnsiTheme="minorHAnsi" w:cstheme="minorHAnsi"/>
@@ -11127,7 +10132,6 @@
         </w:rPr>
         <w:t>to</w:t>
       </w:r>
-      <w:proofErr w:type="gramEnd"/>
       <w:r>
         <w:rPr>
           <w:rFonts w:asciiTheme="minorHAnsi" w:hAnsiTheme="minorHAnsi" w:cstheme="minorHAnsi"/>
@@ -11458,7 +10462,6 @@
         </w:rPr>
         <w:t>count</w:t>
       </w:r>
-      <w:proofErr w:type="gramStart"/>
       <w:r>
         <w:rPr>
           <w:rFonts w:asciiTheme="minorHAnsi" w:hAnsiTheme="minorHAnsi" w:cstheme="minorHAnsi"/>
@@ -11481,16 +10484,7 @@
           <w:sz w:val="20"/>
           <w:szCs w:val="20"/>
         </w:rPr>
-        <w:t>employees</w:t>
-      </w:r>
-      <w:proofErr w:type="gramEnd"/>
-      <w:r>
-        <w:rPr>
-          <w:rFonts w:asciiTheme="minorHAnsi" w:hAnsiTheme="minorHAnsi" w:cstheme="minorHAnsi"/>
-          <w:sz w:val="20"/>
-          <w:szCs w:val="20"/>
-        </w:rPr>
-        <w:t>(Same as Annexure - I)</w:t>
+        <w:t>employees(Same as Annexure - I)</w:t>
       </w:r>
       <w:r>
         <w:rPr>
@@ -11614,7 +10608,6 @@
         </w:rPr>
         <w:t>{{</w:t>
       </w:r>
-      <w:proofErr w:type="spellStart"/>
       <w:r>
         <w:rPr>
           <w:rFonts w:asciiTheme="minorHAnsi" w:hAnsiTheme="minorHAnsi" w:cstheme="minorHAnsi"/>
@@ -11623,7 +10616,6 @@
         </w:rPr>
         <w:t>cardiac_risk_pct</w:t>
       </w:r>
-      <w:proofErr w:type="spellEnd"/>
       <w:r>
         <w:rPr>
           <w:rFonts w:asciiTheme="minorHAnsi" w:hAnsiTheme="minorHAnsi" w:cstheme="minorHAnsi"/>
@@ -11640,7 +10632,6 @@
         </w:rPr>
         <w:t xml:space="preserve"> </w:t>
       </w:r>
-      <w:proofErr w:type="gramStart"/>
       <w:r>
         <w:rPr>
           <w:rFonts w:asciiTheme="minorHAnsi" w:hAnsiTheme="minorHAnsi" w:cstheme="minorHAnsi"/>
@@ -11666,7 +10657,6 @@
         </w:rPr>
         <w:t>.</w:t>
       </w:r>
-      <w:proofErr w:type="gramEnd"/>
       <w:r>
         <w:rPr>
           <w:rFonts w:asciiTheme="minorHAnsi" w:hAnsiTheme="minorHAnsi" w:cstheme="minorHAnsi"/>
@@ -11831,7 +10821,6 @@
         </w:rPr>
         <w:t>{{</w:t>
       </w:r>
-      <w:proofErr w:type="spellStart"/>
       <w:r>
         <w:rPr>
           <w:rStyle w:val="Strong"/>
@@ -11841,7 +10830,6 @@
         </w:rPr>
         <w:t>overall_stress_pct</w:t>
       </w:r>
-      <w:proofErr w:type="spellEnd"/>
       <w:r>
         <w:rPr>
           <w:rStyle w:val="Strong"/>
@@ -11860,7 +10848,6 @@
         </w:rPr>
         <w:t xml:space="preserve"> </w:t>
       </w:r>
-      <w:proofErr w:type="gramStart"/>
       <w:r>
         <w:rPr>
           <w:rFonts w:asciiTheme="minorHAnsi" w:hAnsiTheme="minorHAnsi" w:cstheme="minorHAnsi"/>
@@ -11883,16 +10870,7 @@
           <w:sz w:val="20"/>
           <w:szCs w:val="20"/>
         </w:rPr>
-        <w:t>(</w:t>
-      </w:r>
-      <w:proofErr w:type="gramEnd"/>
-      <w:r>
-        <w:rPr>
-          <w:rFonts w:asciiTheme="minorHAnsi" w:hAnsiTheme="minorHAnsi" w:cstheme="minorHAnsi"/>
-          <w:sz w:val="20"/>
-          <w:szCs w:val="20"/>
-        </w:rPr>
-        <w:t>Annexure</w:t>
+        <w:t>(Annexure</w:t>
       </w:r>
       <w:r>
         <w:rPr>
@@ -12014,7 +10992,6 @@
         </w:rPr>
         <w:t xml:space="preserve"> </w:t>
       </w:r>
-      <w:proofErr w:type="gramStart"/>
       <w:r>
         <w:rPr>
           <w:rFonts w:asciiTheme="minorHAnsi" w:hAnsiTheme="minorHAnsi" w:cstheme="minorHAnsi"/>
@@ -12039,38 +11016,16 @@
           <w:sz w:val="20"/>
           <w:szCs w:val="20"/>
         </w:rPr>
-        <w:t>{{</w:t>
-      </w:r>
-      <w:proofErr w:type="spellStart"/>
-      <w:r>
-        <w:rPr>
-          <w:rFonts w:asciiTheme="minorHAnsi" w:hAnsiTheme="minorHAnsi" w:cstheme="minorHAnsi"/>
-          <w:spacing w:val="-2"/>
-          <w:sz w:val="20"/>
-          <w:szCs w:val="20"/>
-        </w:rPr>
-        <w:t>hab_all_y</w:t>
-      </w:r>
-      <w:proofErr w:type="spellEnd"/>
-      <w:r>
-        <w:rPr>
-          <w:rFonts w:asciiTheme="minorHAnsi" w:hAnsiTheme="minorHAnsi" w:cstheme="minorHAnsi"/>
-          <w:spacing w:val="-2"/>
-          <w:sz w:val="20"/>
-          <w:szCs w:val="20"/>
-        </w:rPr>
-        <w:t>}}</w:t>
-      </w:r>
-      <w:proofErr w:type="gramEnd"/>
-      <w:r>
-        <w:rPr>
-          <w:rFonts w:asciiTheme="minorHAnsi" w:hAnsiTheme="minorHAnsi" w:cstheme="minorHAnsi"/>
-          <w:sz w:val="20"/>
-          <w:szCs w:val="20"/>
-        </w:rPr>
-        <w:t xml:space="preserve"> </w:t>
-      </w:r>
-      <w:proofErr w:type="gramStart"/>
+        <w:t>{{hab_all_y}}</w:t>
+      </w:r>
+      <w:r>
+        <w:rPr>
+          <w:rFonts w:asciiTheme="minorHAnsi" w:hAnsiTheme="minorHAnsi" w:cstheme="minorHAnsi"/>
+          <w:sz w:val="20"/>
+          <w:szCs w:val="20"/>
+        </w:rPr>
+        <w:t xml:space="preserve"> </w:t>
+      </w:r>
       <w:r>
         <w:rPr>
           <w:rFonts w:asciiTheme="minorHAnsi" w:hAnsiTheme="minorHAnsi" w:cstheme="minorHAnsi"/>
@@ -12095,7 +11050,6 @@
         </w:rPr>
         <w:t>.</w:t>
       </w:r>
-      <w:proofErr w:type="gramEnd"/>
       <w:r>
         <w:rPr>
           <w:rFonts w:asciiTheme="minorHAnsi" w:hAnsiTheme="minorHAnsi" w:cstheme="minorHAnsi"/>
@@ -12302,7 +11256,6 @@
         </w:rPr>
         <w:t xml:space="preserve"> </w:t>
       </w:r>
-      <w:proofErr w:type="gramStart"/>
       <w:r>
         <w:rPr>
           <w:rFonts w:asciiTheme="minorHAnsi" w:hAnsiTheme="minorHAnsi" w:cstheme="minorHAnsi"/>
@@ -12327,7 +11280,6 @@
         </w:rPr>
         <w:t>.</w:t>
       </w:r>
-      <w:proofErr w:type="gramEnd"/>
       <w:r>
         <w:rPr>
           <w:rFonts w:asciiTheme="minorHAnsi" w:hAnsiTheme="minorHAnsi" w:cstheme="minorHAnsi"/>
@@ -12553,7 +11505,6 @@
         </w:rPr>
         <w:t xml:space="preserve"> </w:t>
       </w:r>
-      <w:proofErr w:type="gramStart"/>
       <w:r>
         <w:rPr>
           <w:rFonts w:asciiTheme="minorHAnsi" w:hAnsiTheme="minorHAnsi" w:cstheme="minorHAnsi"/>
@@ -12578,7 +11529,6 @@
         </w:rPr>
         <w:t>.</w:t>
       </w:r>
-      <w:proofErr w:type="gramEnd"/>
       <w:r>
         <w:rPr>
           <w:rFonts w:asciiTheme="minorHAnsi" w:hAnsiTheme="minorHAnsi" w:cstheme="minorHAnsi"/>
@@ -12976,14 +11926,12 @@
         </w:rPr>
         <w:t>{{</w:t>
       </w:r>
-      <w:proofErr w:type="spellStart"/>
       <w:r>
         <w:rPr>
           <w:rFonts w:asciiTheme="minorHAnsi" w:hAnsiTheme="minorHAnsi" w:cstheme="minorHAnsi"/>
         </w:rPr>
         <w:t>current_date</w:t>
       </w:r>
-      <w:proofErr w:type="spellEnd"/>
       <w:r>
         <w:rPr>
           <w:rFonts w:asciiTheme="minorHAnsi" w:hAnsiTheme="minorHAnsi" w:cstheme="minorHAnsi"/>
@@ -13074,7 +12022,6 @@
         </w:rPr>
         <w:t xml:space="preserve"> </w:t>
       </w:r>
-      <w:proofErr w:type="gramStart"/>
       <w:r>
         <w:rPr>
           <w:rFonts w:asciiTheme="minorHAnsi" w:hAnsiTheme="minorHAnsi" w:cstheme="minorHAnsi"/>
@@ -13100,7 +12047,6 @@
         </w:rPr>
         <w:t>{{</w:t>
       </w:r>
-      <w:proofErr w:type="gramEnd"/>
       <w:r>
         <w:rPr>
           <w:rFonts w:asciiTheme="minorHAnsi" w:hAnsiTheme="minorHAnsi" w:cstheme="minorHAnsi"/>
@@ -13197,14 +12143,12 @@
         </w:rPr>
         <w:t>{{</w:t>
       </w:r>
-      <w:proofErr w:type="spellStart"/>
       <w:r>
         <w:rPr>
           <w:rFonts w:asciiTheme="minorHAnsi" w:hAnsiTheme="minorHAnsi" w:cstheme="minorHAnsi"/>
         </w:rPr>
         <w:t>current_date</w:t>
       </w:r>
-      <w:proofErr w:type="spellEnd"/>
       <w:r>
         <w:rPr>
           <w:rFonts w:asciiTheme="minorHAnsi" w:hAnsiTheme="minorHAnsi" w:cstheme="minorHAnsi"/>
@@ -13438,25 +12382,7 @@
                 <w:sz w:val="20"/>
                 <w:szCs w:val="20"/>
               </w:rPr>
-              <w:t>{{#employees</w:t>
-            </w:r>
-            <w:proofErr w:type="gramStart"/>
-            <w:r>
-              <w:rPr>
-                <w:rFonts w:asciiTheme="minorHAnsi" w:hAnsiTheme="minorHAnsi" w:cstheme="minorHAnsi"/>
-                <w:sz w:val="20"/>
-                <w:szCs w:val="20"/>
-              </w:rPr>
-              <w:t>}}{</w:t>
-            </w:r>
-            <w:proofErr w:type="gramEnd"/>
-            <w:r>
-              <w:rPr>
-                <w:rFonts w:asciiTheme="minorHAnsi" w:hAnsiTheme="minorHAnsi" w:cstheme="minorHAnsi"/>
-                <w:sz w:val="20"/>
-                <w:szCs w:val="20"/>
-              </w:rPr>
-              <w:t>{sl_no}}</w:t>
+              <w:t>{{#employees}}{{sl_no}}</w:t>
             </w:r>
           </w:p>
         </w:tc>
@@ -13485,25 +12411,7 @@
                 <w:sz w:val="20"/>
                 <w:szCs w:val="20"/>
               </w:rPr>
-              <w:t>{{</w:t>
-            </w:r>
-            <w:proofErr w:type="spellStart"/>
-            <w:r>
-              <w:rPr>
-                <w:rFonts w:asciiTheme="minorHAnsi" w:hAnsiTheme="minorHAnsi" w:cstheme="minorHAnsi"/>
-                <w:sz w:val="20"/>
-                <w:szCs w:val="20"/>
-              </w:rPr>
-              <w:t>emp_id</w:t>
-            </w:r>
-            <w:proofErr w:type="spellEnd"/>
-            <w:r>
-              <w:rPr>
-                <w:rFonts w:asciiTheme="minorHAnsi" w:hAnsiTheme="minorHAnsi" w:cstheme="minorHAnsi"/>
-                <w:sz w:val="20"/>
-                <w:szCs w:val="20"/>
-              </w:rPr>
-              <w:t>}}</w:t>
+              <w:t>{{emp_id}}</w:t>
             </w:r>
           </w:p>
         </w:tc>
@@ -13555,23 +12463,7 @@
                 <w:rStyle w:val="markdown-inline-code"/>
                 <w:rFonts w:ascii="Consolas" w:hAnsi="Consolas"/>
               </w:rPr>
-              <w:t>{{dept</w:t>
-            </w:r>
-            <w:proofErr w:type="gramStart"/>
-            <w:r>
-              <w:rPr>
-                <w:rStyle w:val="markdown-inline-code"/>
-                <w:rFonts w:ascii="Consolas" w:hAnsi="Consolas"/>
-              </w:rPr>
-              <w:t>}}{</w:t>
-            </w:r>
-            <w:proofErr w:type="gramEnd"/>
-            <w:r>
-              <w:rPr>
-                <w:rStyle w:val="markdown-inline-code"/>
-                <w:rFonts w:ascii="Consolas" w:hAnsi="Consolas"/>
-              </w:rPr>
-              <w:t>{/employees}}</w:t>
+              <w:t>{{dept}}{{/employees}}</w:t>
             </w:r>
           </w:p>
           <w:p>
@@ -13615,7 +12507,6 @@
           <w:rFonts w:asciiTheme="minorHAnsi" w:hAnsiTheme="minorHAnsi" w:cstheme="minorHAnsi"/>
         </w:rPr>
       </w:pPr>
-      <w:proofErr w:type="gramStart"/>
       <w:r>
         <w:rPr>
           <w:rFonts w:asciiTheme="minorHAnsi" w:hAnsiTheme="minorHAnsi" w:cstheme="minorHAnsi"/>
@@ -13627,23 +12518,14 @@
         <w:rPr>
           <w:rFonts w:asciiTheme="minorHAnsi" w:hAnsiTheme="minorHAnsi" w:cstheme="minorHAnsi"/>
         </w:rPr>
-        <w:t>{</w:t>
-      </w:r>
-      <w:proofErr w:type="gramEnd"/>
-      <w:r>
-        <w:rPr>
-          <w:rFonts w:asciiTheme="minorHAnsi" w:hAnsiTheme="minorHAnsi" w:cstheme="minorHAnsi"/>
-        </w:rPr>
-        <w:t>{</w:t>
-      </w:r>
-      <w:proofErr w:type="spellStart"/>
+        <w:t>{{</w:t>
+      </w:r>
       <w:r>
         <w:rPr>
           <w:rFonts w:asciiTheme="minorHAnsi" w:hAnsiTheme="minorHAnsi" w:cstheme="minorHAnsi"/>
         </w:rPr>
         <w:t>current_date</w:t>
       </w:r>
-      <w:proofErr w:type="spellEnd"/>
       <w:r>
         <w:rPr>
           <w:rFonts w:asciiTheme="minorHAnsi" w:hAnsiTheme="minorHAnsi" w:cstheme="minorHAnsi"/>
@@ -16500,7 +15382,6 @@
           <w:rFonts w:asciiTheme="minorHAnsi" w:hAnsiTheme="minorHAnsi" w:cstheme="minorHAnsi"/>
         </w:rPr>
       </w:pPr>
-      <w:proofErr w:type="gramStart"/>
       <w:r>
         <w:rPr>
           <w:rFonts w:asciiTheme="minorHAnsi" w:hAnsiTheme="minorHAnsi" w:cstheme="minorHAnsi"/>
@@ -16512,16 +15393,8 @@
         <w:rPr>
           <w:rFonts w:asciiTheme="minorHAnsi" w:hAnsiTheme="minorHAnsi" w:cstheme="minorHAnsi"/>
         </w:rPr>
-        <w:t>{</w:t>
-      </w:r>
-      <w:proofErr w:type="gramEnd"/>
-      <w:r>
-        <w:rPr>
-          <w:rFonts w:asciiTheme="minorHAnsi" w:hAnsiTheme="minorHAnsi" w:cstheme="minorHAnsi"/>
-        </w:rPr>
-        <w:t>{</w:t>
-      </w:r>
-      <w:proofErr w:type="spellStart"/>
+        <w:t>{{</w:t>
+      </w:r>
       <w:r>
         <w:rPr>
           <w:rFonts w:asciiTheme="minorHAnsi" w:hAnsiTheme="minorHAnsi" w:cstheme="minorHAnsi"/>
@@ -16534,7 +15407,6 @@
         </w:rPr>
         <w:t>e</w:t>
       </w:r>
-      <w:proofErr w:type="spellEnd"/>
       <w:r>
         <w:rPr>
           <w:rFonts w:asciiTheme="minorHAnsi" w:hAnsiTheme="minorHAnsi" w:cstheme="minorHAnsi"/>
@@ -16965,23 +15837,13 @@
               </w:rPr>
               <w:t xml:space="preserve"> </w:t>
             </w:r>
-            <w:proofErr w:type="gramStart"/>
-            <w:r>
-              <w:rPr>
-                <w:rFonts w:asciiTheme="minorHAnsi" w:hAnsiTheme="minorHAnsi" w:cstheme="minorHAnsi"/>
-                <w:sz w:val="20"/>
-                <w:szCs w:val="20"/>
-              </w:rPr>
-              <w:t>condition</w:t>
-            </w:r>
-            <w:proofErr w:type="gramEnd"/>
-            <w:r>
-              <w:rPr>
-                <w:rFonts w:asciiTheme="minorHAnsi" w:hAnsiTheme="minorHAnsi" w:cstheme="minorHAnsi"/>
-                <w:sz w:val="20"/>
-                <w:szCs w:val="20"/>
-              </w:rPr>
-              <w:t>,</w:t>
+            <w:r>
+              <w:rPr>
+                <w:rFonts w:asciiTheme="minorHAnsi" w:hAnsiTheme="minorHAnsi" w:cstheme="minorHAnsi"/>
+                <w:sz w:val="20"/>
+                <w:szCs w:val="20"/>
+              </w:rPr>
+              <w:t>condition,</w:t>
             </w:r>
             <w:r>
               <w:rPr>
@@ -16992,23 +15854,13 @@
               </w:rPr>
               <w:t xml:space="preserve"> </w:t>
             </w:r>
-            <w:proofErr w:type="spellStart"/>
-            <w:r>
-              <w:rPr>
-                <w:rFonts w:asciiTheme="minorHAnsi" w:hAnsiTheme="minorHAnsi" w:cstheme="minorHAnsi"/>
-                <w:sz w:val="20"/>
-                <w:szCs w:val="20"/>
-              </w:rPr>
-              <w:t>etc</w:t>
-            </w:r>
-            <w:proofErr w:type="spellEnd"/>
-            <w:r>
-              <w:rPr>
-                <w:rFonts w:asciiTheme="minorHAnsi" w:hAnsiTheme="minorHAnsi" w:cstheme="minorHAnsi"/>
-                <w:sz w:val="20"/>
-                <w:szCs w:val="20"/>
-              </w:rPr>
-              <w:t>)</w:t>
+            <w:r>
+              <w:rPr>
+                <w:rFonts w:asciiTheme="minorHAnsi" w:hAnsiTheme="minorHAnsi" w:cstheme="minorHAnsi"/>
+                <w:sz w:val="20"/>
+                <w:szCs w:val="20"/>
+              </w:rPr>
+              <w:t>etc)</w:t>
             </w:r>
           </w:p>
         </w:tc>
@@ -17197,25 +16049,13 @@
               </w:rPr>
               <w:t xml:space="preserve"> </w:t>
             </w:r>
-            <w:proofErr w:type="spellStart"/>
-            <w:proofErr w:type="gramStart"/>
-            <w:r>
-              <w:rPr>
-                <w:rFonts w:asciiTheme="minorHAnsi" w:hAnsiTheme="minorHAnsi" w:cstheme="minorHAnsi"/>
-                <w:sz w:val="20"/>
-                <w:szCs w:val="20"/>
-              </w:rPr>
-              <w:t>children,etc</w:t>
-            </w:r>
-            <w:proofErr w:type="spellEnd"/>
-            <w:proofErr w:type="gramEnd"/>
-            <w:r>
-              <w:rPr>
-                <w:rFonts w:asciiTheme="minorHAnsi" w:hAnsiTheme="minorHAnsi" w:cstheme="minorHAnsi"/>
-                <w:sz w:val="20"/>
-                <w:szCs w:val="20"/>
-              </w:rPr>
-              <w:t>)</w:t>
+            <w:r>
+              <w:rPr>
+                <w:rFonts w:asciiTheme="minorHAnsi" w:hAnsiTheme="minorHAnsi" w:cstheme="minorHAnsi"/>
+                <w:sz w:val="20"/>
+                <w:szCs w:val="20"/>
+              </w:rPr>
+              <w:t>children,etc)</w:t>
             </w:r>
           </w:p>
         </w:tc>
@@ -17421,23 +16261,13 @@
               </w:rPr>
               <w:t xml:space="preserve"> </w:t>
             </w:r>
-            <w:proofErr w:type="spellStart"/>
-            <w:r>
-              <w:rPr>
-                <w:rFonts w:asciiTheme="minorHAnsi" w:hAnsiTheme="minorHAnsi" w:cstheme="minorHAnsi"/>
-                <w:sz w:val="20"/>
-                <w:szCs w:val="20"/>
-              </w:rPr>
-              <w:t>etc</w:t>
-            </w:r>
-            <w:proofErr w:type="spellEnd"/>
-            <w:r>
-              <w:rPr>
-                <w:rFonts w:asciiTheme="minorHAnsi" w:hAnsiTheme="minorHAnsi" w:cstheme="minorHAnsi"/>
-                <w:sz w:val="20"/>
-                <w:szCs w:val="20"/>
-              </w:rPr>
-              <w:t>)</w:t>
+            <w:r>
+              <w:rPr>
+                <w:rFonts w:asciiTheme="minorHAnsi" w:hAnsiTheme="minorHAnsi" w:cstheme="minorHAnsi"/>
+                <w:sz w:val="20"/>
+                <w:szCs w:val="20"/>
+              </w:rPr>
+              <w:t>etc)</w:t>
             </w:r>
           </w:p>
         </w:tc>
@@ -18802,25 +17632,7 @@
                 <w:sz w:val="20"/>
                 <w:szCs w:val="20"/>
               </w:rPr>
-              <w:t>{{</w:t>
-            </w:r>
-            <w:proofErr w:type="spellStart"/>
-            <w:r>
-              <w:rPr>
-                <w:rFonts w:asciiTheme="minorHAnsi" w:hAnsiTheme="minorHAnsi" w:cstheme="minorHAnsi"/>
-                <w:sz w:val="20"/>
-                <w:szCs w:val="20"/>
-              </w:rPr>
-              <w:t>diabetes_med_yes</w:t>
-            </w:r>
-            <w:proofErr w:type="spellEnd"/>
-            <w:r>
-              <w:rPr>
-                <w:rFonts w:asciiTheme="minorHAnsi" w:hAnsiTheme="minorHAnsi" w:cstheme="minorHAnsi"/>
-                <w:sz w:val="20"/>
-                <w:szCs w:val="20"/>
-              </w:rPr>
-              <w:t>}}</w:t>
+              <w:t>{{diabetes_med_yes}}</w:t>
             </w:r>
             <w:r>
               <w:rPr>
@@ -18855,25 +17667,7 @@
                 <w:sz w:val="20"/>
                 <w:szCs w:val="20"/>
               </w:rPr>
-              <w:t>{{</w:t>
-            </w:r>
-            <w:proofErr w:type="spellStart"/>
-            <w:r>
-              <w:rPr>
-                <w:rFonts w:asciiTheme="minorHAnsi" w:hAnsiTheme="minorHAnsi" w:cstheme="minorHAnsi"/>
-                <w:sz w:val="20"/>
-                <w:szCs w:val="20"/>
-              </w:rPr>
-              <w:t>diabetes_med_no</w:t>
-            </w:r>
-            <w:proofErr w:type="spellEnd"/>
-            <w:r>
-              <w:rPr>
-                <w:rFonts w:asciiTheme="minorHAnsi" w:hAnsiTheme="minorHAnsi" w:cstheme="minorHAnsi"/>
-                <w:sz w:val="20"/>
-                <w:szCs w:val="20"/>
-              </w:rPr>
-              <w:t>}}</w:t>
+              <w:t>{{diabetes_med_no}}</w:t>
             </w:r>
           </w:p>
         </w:tc>
@@ -18956,25 +17750,7 @@
                 <w:sz w:val="20"/>
                 <w:szCs w:val="20"/>
               </w:rPr>
-              <w:t>{{</w:t>
-            </w:r>
-            <w:proofErr w:type="spellStart"/>
-            <w:r>
-              <w:rPr>
-                <w:rFonts w:asciiTheme="minorHAnsi" w:hAnsiTheme="minorHAnsi" w:cstheme="minorHAnsi"/>
-                <w:sz w:val="20"/>
-                <w:szCs w:val="20"/>
-              </w:rPr>
-              <w:t>diabetes_unmed_yes</w:t>
-            </w:r>
-            <w:proofErr w:type="spellEnd"/>
-            <w:r>
-              <w:rPr>
-                <w:rFonts w:asciiTheme="minorHAnsi" w:hAnsiTheme="minorHAnsi" w:cstheme="minorHAnsi"/>
-                <w:sz w:val="20"/>
-                <w:szCs w:val="20"/>
-              </w:rPr>
-              <w:t>}}</w:t>
+              <w:t>{{diabetes_unmed_yes}}</w:t>
             </w:r>
           </w:p>
         </w:tc>
@@ -19001,25 +17777,7 @@
                 <w:sz w:val="20"/>
                 <w:szCs w:val="20"/>
               </w:rPr>
-              <w:t>{{</w:t>
-            </w:r>
-            <w:proofErr w:type="spellStart"/>
-            <w:r>
-              <w:rPr>
-                <w:rFonts w:asciiTheme="minorHAnsi" w:hAnsiTheme="minorHAnsi" w:cstheme="minorHAnsi"/>
-                <w:sz w:val="20"/>
-                <w:szCs w:val="20"/>
-              </w:rPr>
-              <w:t>diabetes_unmed_no</w:t>
-            </w:r>
-            <w:proofErr w:type="spellEnd"/>
-            <w:r>
-              <w:rPr>
-                <w:rFonts w:asciiTheme="minorHAnsi" w:hAnsiTheme="minorHAnsi" w:cstheme="minorHAnsi"/>
-                <w:sz w:val="20"/>
-                <w:szCs w:val="20"/>
-              </w:rPr>
-              <w:t>}}</w:t>
+              <w:t>{{diabetes_unmed_no}}</w:t>
             </w:r>
           </w:p>
         </w:tc>
@@ -19102,25 +17860,7 @@
                 <w:sz w:val="20"/>
                 <w:szCs w:val="20"/>
               </w:rPr>
-              <w:t>{{</w:t>
-            </w:r>
-            <w:proofErr w:type="spellStart"/>
-            <w:r>
-              <w:rPr>
-                <w:rFonts w:asciiTheme="minorHAnsi" w:hAnsiTheme="minorHAnsi" w:cstheme="minorHAnsi"/>
-                <w:sz w:val="20"/>
-                <w:szCs w:val="20"/>
-              </w:rPr>
-              <w:t>family_hist_yes</w:t>
-            </w:r>
-            <w:proofErr w:type="spellEnd"/>
-            <w:r>
-              <w:rPr>
-                <w:rFonts w:asciiTheme="minorHAnsi" w:hAnsiTheme="minorHAnsi" w:cstheme="minorHAnsi"/>
-                <w:sz w:val="20"/>
-                <w:szCs w:val="20"/>
-              </w:rPr>
-              <w:t>}}</w:t>
+              <w:t>{{family_hist_yes}}</w:t>
             </w:r>
           </w:p>
         </w:tc>
@@ -19146,23 +17886,7 @@
                 <w:rStyle w:val="markdown-inline-code"/>
                 <w:rFonts w:ascii="Consolas" w:hAnsi="Consolas"/>
               </w:rPr>
-              <w:t>{{</w:t>
-            </w:r>
-            <w:proofErr w:type="spellStart"/>
-            <w:r>
-              <w:rPr>
-                <w:rStyle w:val="markdown-inline-code"/>
-                <w:rFonts w:ascii="Consolas" w:hAnsi="Consolas"/>
-              </w:rPr>
-              <w:t>family_hist_no</w:t>
-            </w:r>
-            <w:proofErr w:type="spellEnd"/>
-            <w:r>
-              <w:rPr>
-                <w:rStyle w:val="markdown-inline-code"/>
-                <w:rFonts w:ascii="Consolas" w:hAnsi="Consolas"/>
-              </w:rPr>
-              <w:t>}}</w:t>
+              <w:t>{{family_hist_no}}</w:t>
             </w:r>
           </w:p>
         </w:tc>
@@ -19358,14 +18082,12 @@
         </w:rPr>
         <w:t xml:space="preserve"> </w:t>
       </w:r>
-      <w:proofErr w:type="spellStart"/>
       <w:r>
         <w:rPr>
           <w:rFonts w:asciiTheme="minorHAnsi" w:hAnsiTheme="minorHAnsi" w:cstheme="minorHAnsi"/>
         </w:rPr>
         <w:t>Behaviour</w:t>
       </w:r>
-      <w:proofErr w:type="spellEnd"/>
       <w:r>
         <w:rPr>
           <w:rFonts w:asciiTheme="minorHAnsi" w:hAnsiTheme="minorHAnsi" w:cstheme="minorHAnsi"/>
@@ -23561,6 +22283,7 @@
   <w:style w:type="character" w:default="1" w:styleId="DefaultParagraphFont">
     <w:name w:val="Default Paragraph Font"/>
     <w:uiPriority w:val="1"/>
+    <w:semiHidden/>
     <w:unhideWhenUsed/>
   </w:style>
   <w:style w:type="table" w:default="1" w:styleId="TableNormal">

</xml_diff>